<commit_message>
finalized user manual's first version
</commit_message>
<xml_diff>
--- a/User manual.docx
+++ b/User manual.docx
@@ -6,37 +6,36 @@
       <w:pPr>
         <w:pStyle w:val="Title"/>
         <w:rPr>
-          <w:lang w:val="el-GR"/>
-        </w:rPr>
-      </w:pPr>
-      <w:r>
-        <w:rPr>
-          <w:lang w:val="el-GR"/>
-        </w:rPr>
-        <w:t xml:space="preserve">Εγχειρίδιο Χρήσης Τραπεζικής Εφαρμογής </w:t>
-      </w:r>
-      <w:r>
-        <w:rPr>
-          <w:lang w:val="el-GR"/>
-        </w:rPr>
-        <w:t>“</w:t>
-      </w:r>
-      <w:r>
+          <w:sz w:val="40"/>
+          <w:szCs w:val="40"/>
+          <w:lang w:val="el-GR"/>
+        </w:rPr>
+      </w:pPr>
+      <w:r>
+        <w:rPr>
+          <w:sz w:val="40"/>
+          <w:szCs w:val="40"/>
+          <w:lang w:val="el-GR"/>
+        </w:rPr>
+        <w:t>Εγχειρίδιο Χρήσης Τραπεζικής Εφαρμογής “</w:t>
+      </w:r>
+      <w:proofErr w:type="spellStart"/>
+      <w:r>
+        <w:rPr>
+          <w:sz w:val="40"/>
+          <w:szCs w:val="40"/>
+        </w:rPr>
         <w:t>DigiBank</w:t>
       </w:r>
-      <w:r>
-        <w:rPr>
+      <w:proofErr w:type="spellEnd"/>
+      <w:r>
+        <w:rPr>
+          <w:sz w:val="40"/>
+          <w:szCs w:val="40"/>
           <w:lang w:val="el-GR"/>
         </w:rPr>
         <w:t>”</w:t>
       </w:r>
-    </w:p>
-    <w:p>
-      <w:pPr>
-        <w:rPr>
-          <w:lang w:val="el-GR"/>
-        </w:rPr>
-      </w:pPr>
     </w:p>
     <w:sdt>
       <w:sdtPr>
@@ -48,13 +47,13 @@
       </w:sdtPr>
       <w:sdtEndPr>
         <w:rPr>
-          <w:rFonts w:asciiTheme="minorHAnsi" w:eastAsiaTheme="minorHAnsi" w:hAnsiTheme="minorHAnsi" w:cstheme="minorBidi"/>
+          <w:rFonts w:asciiTheme="minorHAnsi" w:eastAsiaTheme="minorEastAsia" w:hAnsiTheme="minorHAnsi" w:cstheme="minorBidi"/>
           <w:b/>
           <w:bCs/>
           <w:noProof/>
           <w:color w:val="auto"/>
-          <w:sz w:val="22"/>
-          <w:szCs w:val="22"/>
+          <w:sz w:val="21"/>
+          <w:szCs w:val="21"/>
         </w:rPr>
       </w:sdtEndPr>
       <w:sdtContent>
@@ -73,7 +72,6 @@
               <w:tab w:val="right" w:leader="dot" w:pos="9350"/>
             </w:tabs>
             <w:rPr>
-              <w:rFonts w:eastAsiaTheme="minorEastAsia"/>
               <w:noProof/>
             </w:rPr>
           </w:pPr>
@@ -152,7 +150,6 @@
               <w:tab w:val="right" w:leader="dot" w:pos="9350"/>
             </w:tabs>
             <w:rPr>
-              <w:rFonts w:eastAsiaTheme="minorEastAsia"/>
               <w:noProof/>
             </w:rPr>
           </w:pPr>
@@ -349,7 +346,7 @@
                 <w:noProof/>
                 <w:webHidden/>
               </w:rPr>
-              <w:t>3</w:t>
+              <w:t>4</w:t>
             </w:r>
             <w:r>
               <w:rPr>
@@ -417,7 +414,7 @@
                 <w:noProof/>
                 <w:webHidden/>
               </w:rPr>
-              <w:t>3</w:t>
+              <w:t>5</w:t>
             </w:r>
             <w:r>
               <w:rPr>
@@ -485,7 +482,7 @@
                 <w:noProof/>
                 <w:webHidden/>
               </w:rPr>
-              <w:t>3</w:t>
+              <w:t>5</w:t>
             </w:r>
             <w:r>
               <w:rPr>
@@ -553,7 +550,7 @@
                 <w:noProof/>
                 <w:webHidden/>
               </w:rPr>
-              <w:t>3</w:t>
+              <w:t>5</w:t>
             </w:r>
             <w:r>
               <w:rPr>
@@ -621,7 +618,7 @@
                 <w:noProof/>
                 <w:webHidden/>
               </w:rPr>
-              <w:t>3</w:t>
+              <w:t>5</w:t>
             </w:r>
             <w:r>
               <w:rPr>
@@ -689,7 +686,7 @@
                 <w:noProof/>
                 <w:webHidden/>
               </w:rPr>
-              <w:t>3</w:t>
+              <w:t>6</w:t>
             </w:r>
             <w:r>
               <w:rPr>
@@ -765,7 +762,7 @@
                 <w:noProof/>
                 <w:webHidden/>
               </w:rPr>
-              <w:t>3</w:t>
+              <w:t>7</w:t>
             </w:r>
             <w:r>
               <w:rPr>
@@ -833,7 +830,7 @@
                 <w:noProof/>
                 <w:webHidden/>
               </w:rPr>
-              <w:t>3</w:t>
+              <w:t>7</w:t>
             </w:r>
             <w:r>
               <w:rPr>
@@ -901,7 +898,7 @@
                 <w:noProof/>
                 <w:webHidden/>
               </w:rPr>
-              <w:t>3</w:t>
+              <w:t>7</w:t>
             </w:r>
             <w:r>
               <w:rPr>
@@ -964,7 +961,6 @@
         <w:rPr>
           <w:lang w:val="el-GR"/>
         </w:rPr>
-        <w:lastRenderedPageBreak/>
         <w:drawing>
           <wp:inline distT="0" distB="0" distL="0" distR="0" wp14:anchorId="6BED9C3D" wp14:editId="1C0487C0">
             <wp:extent cx="5943600" cy="2722245"/>
@@ -981,7 +977,7 @@
                     <pic:cNvPicPr/>
                   </pic:nvPicPr>
                   <pic:blipFill>
-                    <a:blip r:embed="rId5"/>
+                    <a:blip r:embed="rId6"/>
                     <a:stretch>
                       <a:fillRect/>
                     </a:stretch>
@@ -1012,6 +1008,7 @@
         <w:rPr>
           <w:lang w:val="el-GR"/>
         </w:rPr>
+        <w:lastRenderedPageBreak/>
         <w:t xml:space="preserve">Πατώντας το κουμπί </w:t>
       </w:r>
       <w:r>
@@ -1097,7 +1094,7 @@
                     <pic:cNvPicPr/>
                   </pic:nvPicPr>
                   <pic:blipFill>
-                    <a:blip r:embed="rId6" cstate="print">
+                    <a:blip r:embed="rId7" cstate="print">
                       <a:extLst>
                         <a:ext uri="{28A0092B-C50C-407E-A947-70E740481C1C}">
                           <a14:useLocalDpi xmlns:a14="http://schemas.microsoft.com/office/drawing/2010/main" val="0"/>
@@ -1237,177 +1234,11 @@
         <w:rPr>
           <w:lang w:val="el-GR"/>
         </w:rPr>
-        <w:lastRenderedPageBreak/>
         <w:drawing>
           <wp:inline distT="0" distB="0" distL="0" distR="0" wp14:anchorId="1A4C0059" wp14:editId="1E759489">
             <wp:extent cx="5943600" cy="2965450"/>
             <wp:effectExtent l="0" t="0" r="0" b="6350"/>
             <wp:docPr id="4" name="Picture 4"/>
-            <wp:cNvGraphicFramePr>
-              <a:graphicFrameLocks xmlns:a="http://schemas.openxmlformats.org/drawingml/2006/main" noChangeAspect="1"/>
-            </wp:cNvGraphicFramePr>
-            <a:graphic xmlns:a="http://schemas.openxmlformats.org/drawingml/2006/main">
-              <a:graphicData uri="http://schemas.openxmlformats.org/drawingml/2006/picture">
-                <pic:pic xmlns:pic="http://schemas.openxmlformats.org/drawingml/2006/picture">
-                  <pic:nvPicPr>
-                    <pic:cNvPr id="1" name=""/>
-                    <pic:cNvPicPr/>
-                  </pic:nvPicPr>
-                  <pic:blipFill>
-                    <a:blip r:embed="rId7"/>
-                    <a:stretch>
-                      <a:fillRect/>
-                    </a:stretch>
-                  </pic:blipFill>
-                  <pic:spPr>
-                    <a:xfrm>
-                      <a:off x="0" y="0"/>
-                      <a:ext cx="5943600" cy="2965450"/>
-                    </a:xfrm>
-                    <a:prstGeom prst="rect">
-                      <a:avLst/>
-                    </a:prstGeom>
-                  </pic:spPr>
-                </pic:pic>
-              </a:graphicData>
-            </a:graphic>
-          </wp:inline>
-        </w:drawing>
-      </w:r>
-    </w:p>
-    <w:p>
-      <w:pPr>
-        <w:pStyle w:val="Heading1"/>
-        <w:rPr>
-          <w:lang w:val="el-GR"/>
-        </w:rPr>
-      </w:pPr>
-      <w:bookmarkStart w:id="1" w:name="_Toc196652882"/>
-      <w:r>
-        <w:rPr>
-          <w:lang w:val="el-GR"/>
-        </w:rPr>
-        <w:t xml:space="preserve">Το </w:t>
-      </w:r>
-      <w:r>
-        <w:t>Dashboard</w:t>
-      </w:r>
-      <w:bookmarkEnd w:id="1"/>
-    </w:p>
-    <w:p>
-      <w:pPr>
-        <w:rPr>
-          <w:lang w:val="el-GR"/>
-        </w:rPr>
-      </w:pPr>
-      <w:r>
-        <w:rPr>
-          <w:lang w:val="el-GR"/>
-        </w:rPr>
-        <w:t>Εδώ</w:t>
-      </w:r>
-      <w:r>
-        <w:rPr>
-          <w:lang w:val="el-GR"/>
-        </w:rPr>
-        <w:t xml:space="preserve"> </w:t>
-      </w:r>
-      <w:r>
-        <w:rPr>
-          <w:lang w:val="el-GR"/>
-        </w:rPr>
-        <w:t>βρίσκονται όλες οι λειτουργίες της εφαρμογής. Παρακάτω η κάθε παράγραφος περιγράφει ξεχωριστά την κάθε λειτουργία του.</w:t>
-      </w:r>
-    </w:p>
-    <w:p>
-      <w:pPr>
-        <w:pStyle w:val="Heading2"/>
-        <w:rPr>
-          <w:lang w:val="el-GR"/>
-        </w:rPr>
-      </w:pPr>
-      <w:bookmarkStart w:id="2" w:name="_Toc196652883"/>
-      <w:r>
-        <w:rPr>
-          <w:lang w:val="el-GR"/>
-        </w:rPr>
-        <w:t>Δημιουργία τραπεζικής κάρτας</w:t>
-      </w:r>
-      <w:bookmarkEnd w:id="2"/>
-    </w:p>
-    <w:p>
-      <w:pPr>
-        <w:rPr>
-          <w:lang w:val="el-GR"/>
-        </w:rPr>
-      </w:pPr>
-      <w:r>
-        <w:rPr>
-          <w:lang w:val="el-GR"/>
-        </w:rPr>
-        <w:t xml:space="preserve">Η δημιουργία μιας νέας κάρτας γίνεται πατώντας το </w:t>
-      </w:r>
-      <w:r>
-        <w:rPr>
-          <w:b/>
-          <w:lang w:val="el-GR"/>
-        </w:rPr>
-        <w:t>“</w:t>
-      </w:r>
-      <w:r>
-        <w:rPr>
-          <w:b/>
-        </w:rPr>
-        <w:t>New</w:t>
-      </w:r>
-      <w:r>
-        <w:rPr>
-          <w:b/>
-          <w:lang w:val="el-GR"/>
-        </w:rPr>
-        <w:t xml:space="preserve"> </w:t>
-      </w:r>
-      <w:r>
-        <w:rPr>
-          <w:b/>
-        </w:rPr>
-        <w:t>Card</w:t>
-      </w:r>
-      <w:r>
-        <w:rPr>
-          <w:b/>
-          <w:lang w:val="el-GR"/>
-        </w:rPr>
-        <w:t>”</w:t>
-      </w:r>
-      <w:r>
-        <w:rPr>
-          <w:lang w:val="el-GR"/>
-        </w:rPr>
-        <w:t xml:space="preserve"> </w:t>
-      </w:r>
-      <w:r>
-        <w:rPr>
-          <w:lang w:val="el-GR"/>
-        </w:rPr>
-        <w:t>κουμπί:</w:t>
-      </w:r>
-    </w:p>
-    <w:p>
-      <w:pPr>
-        <w:rPr>
-          <w:lang w:val="el-GR"/>
-        </w:rPr>
-      </w:pPr>
-      <w:r>
-        <w:rPr>
-          <w:lang w:val="el-GR"/>
-        </w:rPr>
-        <w:drawing>
-          <wp:inline distT="0" distB="0" distL="0" distR="0" wp14:anchorId="50AD87DC" wp14:editId="334B6A03">
-            <wp:extent cx="5943600" cy="2965450"/>
-            <wp:effectExtent l="0" t="0" r="0" b="6350"/>
-            <wp:docPr id="6" name="Picture 6"/>
             <wp:cNvGraphicFramePr>
               <a:graphicFrameLocks xmlns:a="http://schemas.openxmlformats.org/drawingml/2006/main" noChangeAspect="1"/>
             </wp:cNvGraphicFramePr>
@@ -1442,6 +1273,172 @@
     </w:p>
     <w:p>
       <w:pPr>
+        <w:pStyle w:val="Heading1"/>
+        <w:rPr>
+          <w:lang w:val="el-GR"/>
+        </w:rPr>
+      </w:pPr>
+      <w:bookmarkStart w:id="1" w:name="_Toc196652882"/>
+      <w:r>
+        <w:rPr>
+          <w:lang w:val="el-GR"/>
+        </w:rPr>
+        <w:t xml:space="preserve">Το </w:t>
+      </w:r>
+      <w:r>
+        <w:t>Dashboard</w:t>
+      </w:r>
+      <w:bookmarkEnd w:id="1"/>
+    </w:p>
+    <w:p>
+      <w:pPr>
+        <w:rPr>
+          <w:lang w:val="el-GR"/>
+        </w:rPr>
+      </w:pPr>
+      <w:r>
+        <w:rPr>
+          <w:lang w:val="el-GR"/>
+        </w:rPr>
+        <w:t>Εδώ</w:t>
+      </w:r>
+      <w:r>
+        <w:rPr>
+          <w:lang w:val="el-GR"/>
+        </w:rPr>
+        <w:t xml:space="preserve"> </w:t>
+      </w:r>
+      <w:r>
+        <w:rPr>
+          <w:lang w:val="el-GR"/>
+        </w:rPr>
+        <w:t>βρίσκονται όλες οι λειτουργίες της εφαρμογής. Παρακάτω η κάθε παράγραφος περιγράφει ξεχωριστά την κάθε λειτουργία του.</w:t>
+      </w:r>
+    </w:p>
+    <w:p>
+      <w:pPr>
+        <w:pStyle w:val="Heading2"/>
+        <w:rPr>
+          <w:lang w:val="el-GR"/>
+        </w:rPr>
+      </w:pPr>
+      <w:bookmarkStart w:id="2" w:name="_Toc196652883"/>
+      <w:r>
+        <w:rPr>
+          <w:lang w:val="el-GR"/>
+        </w:rPr>
+        <w:t>Δημιουργία τραπεζικής κάρτας</w:t>
+      </w:r>
+      <w:bookmarkEnd w:id="2"/>
+    </w:p>
+    <w:p>
+      <w:pPr>
+        <w:rPr>
+          <w:lang w:val="el-GR"/>
+        </w:rPr>
+      </w:pPr>
+      <w:r>
+        <w:rPr>
+          <w:lang w:val="el-GR"/>
+        </w:rPr>
+        <w:t xml:space="preserve">Η δημιουργία μιας νέας κάρτας γίνεται πατώντας το </w:t>
+      </w:r>
+      <w:r>
+        <w:rPr>
+          <w:b/>
+          <w:lang w:val="el-GR"/>
+        </w:rPr>
+        <w:t>“</w:t>
+      </w:r>
+      <w:r>
+        <w:rPr>
+          <w:b/>
+        </w:rPr>
+        <w:t>New</w:t>
+      </w:r>
+      <w:r>
+        <w:rPr>
+          <w:b/>
+          <w:lang w:val="el-GR"/>
+        </w:rPr>
+        <w:t xml:space="preserve"> </w:t>
+      </w:r>
+      <w:r>
+        <w:rPr>
+          <w:b/>
+        </w:rPr>
+        <w:t>Card</w:t>
+      </w:r>
+      <w:r>
+        <w:rPr>
+          <w:b/>
+          <w:lang w:val="el-GR"/>
+        </w:rPr>
+        <w:t>”</w:t>
+      </w:r>
+      <w:r>
+        <w:rPr>
+          <w:lang w:val="el-GR"/>
+        </w:rPr>
+        <w:t xml:space="preserve"> </w:t>
+      </w:r>
+      <w:r>
+        <w:rPr>
+          <w:lang w:val="el-GR"/>
+        </w:rPr>
+        <w:t>κουμπί:</w:t>
+      </w:r>
+    </w:p>
+    <w:p>
+      <w:pPr>
+        <w:rPr>
+          <w:lang w:val="el-GR"/>
+        </w:rPr>
+      </w:pPr>
+      <w:r>
+        <w:rPr>
+          <w:lang w:val="el-GR"/>
+        </w:rPr>
+        <w:lastRenderedPageBreak/>
+        <w:drawing>
+          <wp:inline distT="0" distB="0" distL="0" distR="0" wp14:anchorId="50AD87DC" wp14:editId="334B6A03">
+            <wp:extent cx="5943600" cy="2965450"/>
+            <wp:effectExtent l="0" t="0" r="0" b="6350"/>
+            <wp:docPr id="6" name="Picture 6"/>
+            <wp:cNvGraphicFramePr>
+              <a:graphicFrameLocks xmlns:a="http://schemas.openxmlformats.org/drawingml/2006/main" noChangeAspect="1"/>
+            </wp:cNvGraphicFramePr>
+            <a:graphic xmlns:a="http://schemas.openxmlformats.org/drawingml/2006/main">
+              <a:graphicData uri="http://schemas.openxmlformats.org/drawingml/2006/picture">
+                <pic:pic xmlns:pic="http://schemas.openxmlformats.org/drawingml/2006/picture">
+                  <pic:nvPicPr>
+                    <pic:cNvPr id="1" name=""/>
+                    <pic:cNvPicPr/>
+                  </pic:nvPicPr>
+                  <pic:blipFill>
+                    <a:blip r:embed="rId9"/>
+                    <a:stretch>
+                      <a:fillRect/>
+                    </a:stretch>
+                  </pic:blipFill>
+                  <pic:spPr>
+                    <a:xfrm>
+                      <a:off x="0" y="0"/>
+                      <a:ext cx="5943600" cy="2965450"/>
+                    </a:xfrm>
+                    <a:prstGeom prst="rect">
+                      <a:avLst/>
+                    </a:prstGeom>
+                  </pic:spPr>
+                </pic:pic>
+              </a:graphicData>
+            </a:graphic>
+          </wp:inline>
+        </w:drawing>
+      </w:r>
+    </w:p>
+    <w:p>
+      <w:pPr>
         <w:rPr>
           <w:lang w:val="el-GR"/>
         </w:rPr>
@@ -1475,7 +1472,6 @@
         <w:rPr>
           <w:lang w:val="el-GR"/>
         </w:rPr>
-        <w:lastRenderedPageBreak/>
         <w:drawing>
           <wp:anchor distT="0" distB="0" distL="114300" distR="114300" simplePos="0" relativeHeight="251660288" behindDoc="0" locked="0" layoutInCell="1" allowOverlap="1" wp14:anchorId="702A34F6" wp14:editId="1E3EC77E">
             <wp:simplePos x="0" y="0"/>
@@ -1500,7 +1496,7 @@
                     <pic:cNvPicPr/>
                   </pic:nvPicPr>
                   <pic:blipFill>
-                    <a:blip r:embed="rId9">
+                    <a:blip r:embed="rId10">
                       <a:extLst>
                         <a:ext uri="{28A0092B-C50C-407E-A947-70E740481C1C}">
                           <a14:useLocalDpi xmlns:a14="http://schemas.microsoft.com/office/drawing/2010/main" val="0"/>
@@ -1560,7 +1556,7 @@
                     <pic:cNvPicPr/>
                   </pic:nvPicPr>
                   <pic:blipFill>
-                    <a:blip r:embed="rId10" cstate="print">
+                    <a:blip r:embed="rId11" cstate="print">
                       <a:extLst>
                         <a:ext uri="{28A0092B-C50C-407E-A947-70E740481C1C}">
                           <a14:useLocalDpi xmlns:a14="http://schemas.microsoft.com/office/drawing/2010/main" val="0"/>
@@ -1695,6 +1691,7 @@
         <w:rPr>
           <w:lang w:val="el-GR"/>
         </w:rPr>
+        <w:lastRenderedPageBreak/>
         <w:drawing>
           <wp:inline distT="0" distB="0" distL="0" distR="0" wp14:anchorId="7BA8B583" wp14:editId="5492420C">
             <wp:extent cx="5943600" cy="2965450"/>
@@ -1711,7 +1708,7 @@
                     <pic:cNvPicPr/>
                   </pic:nvPicPr>
                   <pic:blipFill>
-                    <a:blip r:embed="rId11"/>
+                    <a:blip r:embed="rId12"/>
                     <a:stretch>
                       <a:fillRect/>
                     </a:stretch>
@@ -1766,7 +1763,7 @@
                     <pic:cNvPicPr/>
                   </pic:nvPicPr>
                   <pic:blipFill>
-                    <a:blip r:embed="rId12" cstate="print">
+                    <a:blip r:embed="rId13" cstate="print">
                       <a:extLst>
                         <a:ext uri="{28A0092B-C50C-407E-A947-70E740481C1C}">
                           <a14:useLocalDpi xmlns:a14="http://schemas.microsoft.com/office/drawing/2010/main" val="0"/>
@@ -1940,6 +1937,180 @@
         </w:rPr>
         <w:t>. Λεπτομέρειες για την κάθε μια υπάρχει στις ακόλουθες παραγράφους.</w:t>
       </w:r>
+      <w:r>
+        <w:rPr>
+          <w:lang w:val="el-GR"/>
+        </w:rPr>
+        <w:t xml:space="preserve"> </w:t>
+      </w:r>
+      <w:r>
+        <w:rPr>
+          <w:lang w:val="el-GR"/>
+        </w:rPr>
+        <w:t>Η αλλαγή της κατηγορίας που θέλει ο χρήστης να πραγματοποιήσει γίνεται είτε μέσω τ</w:t>
+      </w:r>
+      <w:r>
+        <w:rPr>
+          <w:lang w:val="el-GR"/>
+        </w:rPr>
+        <w:t xml:space="preserve">ων οριζόντιων κουμπιών </w:t>
+      </w:r>
+      <w:r>
+        <w:rPr>
+          <w:b/>
+          <w:lang w:val="el-GR"/>
+        </w:rPr>
+        <w:t>“</w:t>
+      </w:r>
+      <w:r>
+        <w:rPr>
+          <w:b/>
+        </w:rPr>
+        <w:t>Deposit</w:t>
+      </w:r>
+      <w:r>
+        <w:rPr>
+          <w:b/>
+          <w:lang w:val="el-GR"/>
+        </w:rPr>
+        <w:t>”</w:t>
+      </w:r>
+      <w:r>
+        <w:rPr>
+          <w:lang w:val="el-GR"/>
+        </w:rPr>
+        <w:t xml:space="preserve">, </w:t>
+      </w:r>
+      <w:r>
+        <w:rPr>
+          <w:b/>
+          <w:lang w:val="el-GR"/>
+        </w:rPr>
+        <w:t>“</w:t>
+      </w:r>
+      <w:r>
+        <w:rPr>
+          <w:b/>
+        </w:rPr>
+        <w:t>Withdrawal</w:t>
+      </w:r>
+      <w:r>
+        <w:rPr>
+          <w:b/>
+          <w:lang w:val="el-GR"/>
+        </w:rPr>
+        <w:t xml:space="preserve">” </w:t>
+      </w:r>
+      <w:r>
+        <w:rPr>
+          <w:lang w:val="el-GR"/>
+        </w:rPr>
+        <w:t xml:space="preserve">και </w:t>
+      </w:r>
+      <w:r>
+        <w:rPr>
+          <w:b/>
+          <w:lang w:val="el-GR"/>
+        </w:rPr>
+        <w:t>“</w:t>
+      </w:r>
+      <w:r>
+        <w:rPr>
+          <w:b/>
+        </w:rPr>
+        <w:t>Transfer</w:t>
+      </w:r>
+      <w:r>
+        <w:rPr>
+          <w:b/>
+          <w:lang w:val="el-GR"/>
+        </w:rPr>
+        <w:t>”</w:t>
+      </w:r>
+      <w:r>
+        <w:rPr>
+          <w:lang w:val="el-GR"/>
+        </w:rPr>
+        <w:t>, είτε μέσω των κάθετων</w:t>
+      </w:r>
+      <w:r>
+        <w:rPr>
+          <w:lang w:val="el-GR"/>
+        </w:rPr>
+        <w:t xml:space="preserve"> κουμπιών</w:t>
+      </w:r>
+      <w:r>
+        <w:rPr>
+          <w:lang w:val="el-GR"/>
+        </w:rPr>
+        <w:t xml:space="preserve"> στο </w:t>
+      </w:r>
+      <w:r>
+        <w:rPr>
+          <w:b/>
+        </w:rPr>
+        <w:t>Sidebar</w:t>
+      </w:r>
+      <w:r>
+        <w:rPr>
+          <w:lang w:val="el-GR"/>
+        </w:rPr>
+        <w:t xml:space="preserve"> </w:t>
+      </w:r>
+      <w:r>
+        <w:rPr>
+          <w:lang w:val="el-GR"/>
+        </w:rPr>
+        <w:t>στα δεξιά της οθόνης:</w:t>
+      </w:r>
+    </w:p>
+    <w:p>
+      <w:pPr>
+        <w:rPr>
+          <w:lang w:val="el-GR"/>
+        </w:rPr>
+      </w:pPr>
+      <w:r>
+        <w:rPr>
+          <w:lang w:val="el-GR"/>
+        </w:rPr>
+        <w:lastRenderedPageBreak/>
+        <w:drawing>
+          <wp:inline distT="0" distB="0" distL="0" distR="0" wp14:anchorId="49AD549F" wp14:editId="5F697D31">
+            <wp:extent cx="5943600" cy="2968625"/>
+            <wp:effectExtent l="0" t="0" r="0" b="3175"/>
+            <wp:docPr id="19" name="Picture 19"/>
+            <wp:cNvGraphicFramePr>
+              <a:graphicFrameLocks xmlns:a="http://schemas.openxmlformats.org/drawingml/2006/main" noChangeAspect="1"/>
+            </wp:cNvGraphicFramePr>
+            <a:graphic xmlns:a="http://schemas.openxmlformats.org/drawingml/2006/main">
+              <a:graphicData uri="http://schemas.openxmlformats.org/drawingml/2006/picture">
+                <pic:pic xmlns:pic="http://schemas.openxmlformats.org/drawingml/2006/picture">
+                  <pic:nvPicPr>
+                    <pic:cNvPr id="1" name=""/>
+                    <pic:cNvPicPr/>
+                  </pic:nvPicPr>
+                  <pic:blipFill>
+                    <a:blip r:embed="rId14"/>
+                    <a:stretch>
+                      <a:fillRect/>
+                    </a:stretch>
+                  </pic:blipFill>
+                  <pic:spPr>
+                    <a:xfrm>
+                      <a:off x="0" y="0"/>
+                      <a:ext cx="5943600" cy="2968625"/>
+                    </a:xfrm>
+                    <a:prstGeom prst="rect">
+                      <a:avLst/>
+                    </a:prstGeom>
+                  </pic:spPr>
+                </pic:pic>
+              </a:graphicData>
+            </a:graphic>
+          </wp:inline>
+        </w:drawing>
+      </w:r>
     </w:p>
     <w:p>
       <w:pPr>
@@ -1947,7 +2118,6 @@
       </w:pPr>
       <w:bookmarkStart w:id="4" w:name="_Toc196652885"/>
       <w:r>
-        <w:lastRenderedPageBreak/>
         <w:t>Deposit</w:t>
       </w:r>
       <w:bookmarkEnd w:id="4"/>
@@ -1987,7 +2157,7 @@
                     <pic:cNvPicPr/>
                   </pic:nvPicPr>
                   <pic:blipFill>
-                    <a:blip r:embed="rId13">
+                    <a:blip r:embed="rId15">
                       <a:extLst>
                         <a:ext uri="{28A0092B-C50C-407E-A947-70E740481C1C}">
                           <a14:useLocalDpi xmlns:a14="http://schemas.microsoft.com/office/drawing/2010/main" val="0"/>
@@ -2151,11 +2321,52 @@
         <w:rPr>
           <w:lang w:val="el-GR"/>
         </w:rPr>
-        <w:t xml:space="preserve">Για παράδειγμα, η μεταφορά 50$ από μια κάρτα Πειραιώς σε μια κάρτα </w:t>
-      </w:r>
-      <w:r>
+        <w:lastRenderedPageBreak/>
+        <w:t xml:space="preserve">Για παράδειγμα, η μεταφορά </w:t>
+      </w:r>
+      <w:r>
+        <w:rPr>
+          <w:b/>
+          <w:lang w:val="el-GR"/>
+        </w:rPr>
+        <w:t>5</w:t>
+      </w:r>
+      <w:bookmarkStart w:id="7" w:name="_GoBack"/>
+      <w:bookmarkEnd w:id="7"/>
+      <w:r>
+        <w:rPr>
+          <w:b/>
+          <w:lang w:val="el-GR"/>
+        </w:rPr>
+        <w:t>0$</w:t>
+      </w:r>
+      <w:r>
+        <w:rPr>
+          <w:lang w:val="el-GR"/>
+        </w:rPr>
+        <w:t xml:space="preserve"> από μια </w:t>
+      </w:r>
+      <w:r>
+        <w:rPr>
+          <w:b/>
+          <w:lang w:val="el-GR"/>
+        </w:rPr>
+        <w:t>κάρτα Πειραιώς</w:t>
+      </w:r>
+      <w:r>
+        <w:rPr>
+          <w:lang w:val="el-GR"/>
+        </w:rPr>
+        <w:t xml:space="preserve"> σε μια κάρτα </w:t>
+      </w:r>
+      <w:proofErr w:type="spellStart"/>
+      <w:r>
+        <w:rPr>
+          <w:b/>
+        </w:rPr>
         <w:t>Eurobank</w:t>
       </w:r>
+      <w:proofErr w:type="spellEnd"/>
       <w:r>
         <w:rPr>
           <w:lang w:val="el-GR"/>
@@ -2203,7 +2414,7 @@
                     <pic:cNvPicPr/>
                   </pic:nvPicPr>
                   <pic:blipFill>
-                    <a:blip r:embed="rId14">
+                    <a:blip r:embed="rId16">
                       <a:extLst>
                         <a:ext uri="{28A0092B-C50C-407E-A947-70E740481C1C}">
                           <a14:useLocalDpi xmlns:a14="http://schemas.microsoft.com/office/drawing/2010/main" val="0"/>
@@ -2234,11 +2445,11 @@
       <w:pPr>
         <w:pStyle w:val="Heading2"/>
       </w:pPr>
-      <w:bookmarkStart w:id="7" w:name="_Toc196652888"/>
+      <w:bookmarkStart w:id="8" w:name="_Toc196652888"/>
       <w:r>
         <w:t>History</w:t>
       </w:r>
-      <w:bookmarkEnd w:id="7"/>
+      <w:bookmarkEnd w:id="8"/>
     </w:p>
     <w:p>
       <w:pPr>
@@ -2271,14 +2482,7 @@
         <w:rPr>
           <w:lang w:val="el-GR"/>
         </w:rPr>
-        <w:t xml:space="preserve"> Επίσης το μενού του ιστορικού επιτρέπει στον χρήστη να χρησιμοποιήσει φίλτρα για να δει </w:t>
-      </w:r>
-      <w:r>
-        <w:rPr>
-          <w:lang w:val="el-GR"/>
-        </w:rPr>
-        <w:lastRenderedPageBreak/>
-        <w:t xml:space="preserve">συγκεκριμένες συναλλαγές. Για παράδειγμα μπορεί να δει τις </w:t>
+        <w:t xml:space="preserve"> Επίσης το μενού του ιστορικού επιτρέπει στον χρήστη να χρησιμοποιήσει φίλτρα για να δει συγκεκριμένες συναλλαγές. Για παράδειγμα μπορεί να δει τις </w:t>
       </w:r>
       <w:r>
         <w:rPr>
@@ -2360,7 +2564,7 @@
                     <pic:cNvPicPr/>
                   </pic:nvPicPr>
                   <pic:blipFill>
-                    <a:blip r:embed="rId15"/>
+                    <a:blip r:embed="rId17"/>
                     <a:stretch>
                       <a:fillRect/>
                     </a:stretch>
@@ -2383,15 +2587,6 @@
     </w:p>
     <w:p>
       <w:pPr>
-        <w:rPr>
-          <w:lang w:val="el-GR"/>
-        </w:rPr>
-      </w:pPr>
-      <w:bookmarkStart w:id="8" w:name="_GoBack"/>
-      <w:bookmarkEnd w:id="8"/>
-    </w:p>
-    <w:p>
-      <w:pPr>
         <w:pStyle w:val="Heading2"/>
       </w:pPr>
       <w:bookmarkStart w:id="9" w:name="_Toc196652889"/>
@@ -2402,14 +2597,380 @@
     </w:p>
     <w:p>
       <w:pPr>
+        <w:rPr>
+          <w:lang w:val="el-GR"/>
+        </w:rPr>
+      </w:pPr>
+      <w:r>
+        <w:rPr>
+          <w:lang w:val="el-GR"/>
+        </w:rPr>
+        <w:t>Ο πίνακας των στατιστικών δείχνει στον χρήστη χρήσιμες πληροφορίες για τον λογαριασμό του.</w:t>
+      </w:r>
+      <w:r>
+        <w:rPr>
+          <w:lang w:val="el-GR"/>
+        </w:rPr>
+        <w:t xml:space="preserve"> Οι πληροφορίες που δείχνει είναι:</w:t>
+      </w:r>
+    </w:p>
+    <w:p>
+      <w:pPr>
+        <w:pStyle w:val="ListParagraph"/>
+        <w:numPr>
+          <w:ilvl w:val="0"/>
+          <w:numId w:val="1"/>
+        </w:numPr>
+        <w:rPr>
+          <w:lang w:val="el-GR"/>
+        </w:rPr>
+      </w:pPr>
+      <w:r>
+        <w:rPr>
+          <w:b/>
+        </w:rPr>
+        <w:t>Deposits</w:t>
+      </w:r>
+      <w:r>
+        <w:rPr>
+          <w:b/>
+          <w:lang w:val="el-GR"/>
+        </w:rPr>
+        <w:t xml:space="preserve"> </w:t>
+      </w:r>
+      <w:r>
+        <w:rPr>
+          <w:b/>
+        </w:rPr>
+        <w:t>Ratio</w:t>
+      </w:r>
+      <w:r>
+        <w:rPr>
+          <w:lang w:val="el-GR"/>
+        </w:rPr>
+        <w:t xml:space="preserve">: </w:t>
+      </w:r>
+      <w:r>
+        <w:rPr>
+          <w:lang w:val="el-GR"/>
+        </w:rPr>
+        <w:t>Η αναλογία καταθέσεων προς όλες τις υπόλοιπες συναλλαγές</w:t>
+      </w:r>
+    </w:p>
+    <w:p>
+      <w:pPr>
+        <w:pStyle w:val="ListParagraph"/>
+        <w:numPr>
+          <w:ilvl w:val="0"/>
+          <w:numId w:val="1"/>
+        </w:numPr>
+        <w:rPr>
+          <w:lang w:val="el-GR"/>
+        </w:rPr>
+      </w:pPr>
+      <w:r>
+        <w:rPr>
+          <w:b/>
+        </w:rPr>
+        <w:t>Withdrawals</w:t>
+      </w:r>
+      <w:r>
+        <w:rPr>
+          <w:b/>
+          <w:lang w:val="el-GR"/>
+        </w:rPr>
+        <w:t xml:space="preserve"> </w:t>
+      </w:r>
+      <w:r>
+        <w:rPr>
+          <w:b/>
+        </w:rPr>
+        <w:t>Ratio</w:t>
+      </w:r>
+      <w:r>
+        <w:rPr>
+          <w:lang w:val="el-GR"/>
+        </w:rPr>
+        <w:t xml:space="preserve">: </w:t>
+      </w:r>
+      <w:r>
+        <w:rPr>
+          <w:lang w:val="el-GR"/>
+        </w:rPr>
+        <w:t>Η αναλογία αναλήψεων προς όλες τις υπόλοιπες συναλλαγές</w:t>
+      </w:r>
+    </w:p>
+    <w:p>
+      <w:pPr>
+        <w:pStyle w:val="ListParagraph"/>
+        <w:numPr>
+          <w:ilvl w:val="0"/>
+          <w:numId w:val="1"/>
+        </w:numPr>
+        <w:rPr>
+          <w:lang w:val="el-GR"/>
+        </w:rPr>
+      </w:pPr>
+      <w:r>
+        <w:rPr>
+          <w:b/>
+        </w:rPr>
+        <w:t>Transfers</w:t>
+      </w:r>
+      <w:r>
+        <w:rPr>
+          <w:b/>
+          <w:lang w:val="el-GR"/>
+        </w:rPr>
+        <w:t xml:space="preserve"> </w:t>
+      </w:r>
+      <w:r>
+        <w:rPr>
+          <w:b/>
+        </w:rPr>
+        <w:t>Ratio</w:t>
+      </w:r>
+      <w:r>
+        <w:rPr>
+          <w:lang w:val="el-GR"/>
+        </w:rPr>
+        <w:t>:</w:t>
+      </w:r>
+      <w:r>
+        <w:rPr>
+          <w:lang w:val="el-GR"/>
+        </w:rPr>
+        <w:t xml:space="preserve"> </w:t>
+      </w:r>
+      <w:r>
+        <w:rPr>
+          <w:lang w:val="el-GR"/>
+        </w:rPr>
+        <w:t>Η αναλογία μεταφορών προς όλες τις υπόλοιπες συναλλαγές</w:t>
+      </w:r>
+    </w:p>
+    <w:p>
+      <w:pPr>
+        <w:pStyle w:val="ListParagraph"/>
+        <w:numPr>
+          <w:ilvl w:val="0"/>
+          <w:numId w:val="1"/>
+        </w:numPr>
+        <w:rPr>
+          <w:lang w:val="el-GR"/>
+        </w:rPr>
+      </w:pPr>
+      <w:r>
+        <w:rPr>
+          <w:b/>
+        </w:rPr>
+        <w:t>Withdrawal</w:t>
+      </w:r>
+      <w:r>
+        <w:rPr>
+          <w:b/>
+          <w:lang w:val="el-GR"/>
+        </w:rPr>
+        <w:t>/</w:t>
+      </w:r>
+      <w:r>
+        <w:rPr>
+          <w:b/>
+        </w:rPr>
+        <w:t>Deposit</w:t>
+      </w:r>
+      <w:r>
+        <w:rPr>
+          <w:b/>
+          <w:lang w:val="el-GR"/>
+        </w:rPr>
+        <w:t xml:space="preserve"> </w:t>
+      </w:r>
+      <w:r>
+        <w:rPr>
+          <w:b/>
+        </w:rPr>
+        <w:t>Ratio</w:t>
+      </w:r>
+      <w:r>
+        <w:rPr>
+          <w:lang w:val="el-GR"/>
+        </w:rPr>
+        <w:t>:</w:t>
+      </w:r>
+      <w:r>
+        <w:rPr>
+          <w:lang w:val="el-GR"/>
+        </w:rPr>
+        <w:t xml:space="preserve"> </w:t>
+      </w:r>
+      <w:r>
+        <w:rPr>
+          <w:lang w:val="el-GR"/>
+        </w:rPr>
+        <w:t>Η</w:t>
+      </w:r>
+      <w:r>
+        <w:rPr>
+          <w:lang w:val="el-GR"/>
+        </w:rPr>
+        <w:t xml:space="preserve"> </w:t>
+      </w:r>
+      <w:r>
+        <w:rPr>
+          <w:lang w:val="el-GR"/>
+        </w:rPr>
+        <w:t>αναλογία ανάμεσα στις καταθέσεις και τις αναλήψεις</w:t>
+      </w:r>
+    </w:p>
+    <w:p>
+      <w:pPr>
+        <w:pStyle w:val="ListParagraph"/>
+        <w:numPr>
+          <w:ilvl w:val="0"/>
+          <w:numId w:val="1"/>
+        </w:numPr>
+        <w:rPr>
+          <w:lang w:val="el-GR"/>
+        </w:rPr>
+      </w:pPr>
+      <w:r>
+        <w:rPr>
+          <w:b/>
+        </w:rPr>
+        <w:lastRenderedPageBreak/>
+        <w:t>Average</w:t>
+      </w:r>
+      <w:r>
+        <w:rPr>
+          <w:b/>
+          <w:lang w:val="el-GR"/>
+        </w:rPr>
+        <w:t xml:space="preserve"> </w:t>
+      </w:r>
+      <w:r>
+        <w:rPr>
+          <w:b/>
+        </w:rPr>
+        <w:t>Transaction</w:t>
+      </w:r>
+      <w:r>
+        <w:rPr>
+          <w:lang w:val="el-GR"/>
+        </w:rPr>
+        <w:t>:</w:t>
+      </w:r>
+      <w:r>
+        <w:rPr>
+          <w:lang w:val="el-GR"/>
+        </w:rPr>
+        <w:t xml:space="preserve"> </w:t>
+      </w:r>
+      <w:r>
+        <w:rPr>
+          <w:lang w:val="el-GR"/>
+        </w:rPr>
+        <w:t xml:space="preserve">Μέσος όρος χρηματικού ποσού που συναλλάσεται, είτε σε αναλήψεις, είτε σε καταθέσεις, είτε σε μεταφορές. Ο αριθμός που αναγράφεται πάνω από το γράφημα είναι ο μέσος όρος σε αναλήψεις και καταθέσεις συνολικά </w:t>
+      </w:r>
+      <w:r>
+        <w:rPr>
+          <w:lang w:val="el-GR"/>
+        </w:rPr>
+        <w:t>σε όλη την ιστορία του λογαριασμού.</w:t>
+      </w:r>
+    </w:p>
+    <w:p>
+      <w:pPr>
+        <w:pStyle w:val="ListParagraph"/>
+        <w:numPr>
+          <w:ilvl w:val="0"/>
+          <w:numId w:val="1"/>
+        </w:numPr>
+        <w:rPr>
+          <w:lang w:val="el-GR"/>
+        </w:rPr>
+      </w:pPr>
+      <w:r>
+        <w:rPr>
+          <w:b/>
+        </w:rPr>
+        <w:t>Transaction</w:t>
+      </w:r>
+      <w:r>
+        <w:rPr>
+          <w:b/>
+          <w:lang w:val="el-GR"/>
+        </w:rPr>
+        <w:t xml:space="preserve"> </w:t>
+      </w:r>
+      <w:r>
+        <w:rPr>
+          <w:b/>
+        </w:rPr>
+        <w:t>Velocity</w:t>
+      </w:r>
+      <w:r>
+        <w:rPr>
+          <w:lang w:val="el-GR"/>
+        </w:rPr>
+        <w:t>:</w:t>
+      </w:r>
+      <w:r>
+        <w:rPr>
+          <w:lang w:val="el-GR"/>
+        </w:rPr>
+        <w:t xml:space="preserve"> </w:t>
+      </w:r>
+      <w:r>
+        <w:rPr>
+          <w:lang w:val="el-GR"/>
+        </w:rPr>
+        <w:t>Μέσος όρος συναλλαγών σε ημερήσια βάση.</w:t>
+      </w:r>
+      <w:r>
+        <w:rPr>
+          <w:lang w:val="el-GR"/>
+        </w:rPr>
+        <w:t xml:space="preserve"> </w:t>
+      </w:r>
+      <w:r>
+        <w:rPr>
+          <w:lang w:val="el-GR"/>
+        </w:rPr>
+        <w:t>Ο αριθμός πάνω από το γράφημα είναι ο μέσος ημερήσιος όρος συναλλαγών σε όλη την ιστορία του λογαριασμού.</w:t>
+      </w:r>
+    </w:p>
+    <w:p>
+      <w:pPr>
         <w:pStyle w:val="Heading2"/>
+        <w:rPr>
+          <w:lang w:val="el-GR"/>
+        </w:rPr>
       </w:pPr>
       <w:bookmarkStart w:id="10" w:name="_Toc196652890"/>
       <w:r>
         <w:rPr>
           <w:lang w:val="el-GR"/>
         </w:rPr>
-        <w:t xml:space="preserve">Επιπλέον λειτουργίες </w:t>
+        <w:t>Επιπλέον</w:t>
+      </w:r>
+      <w:r>
+        <w:rPr>
+          <w:lang w:val="el-GR"/>
+        </w:rPr>
+        <w:t xml:space="preserve"> </w:t>
+      </w:r>
+      <w:r>
+        <w:rPr>
+          <w:lang w:val="el-GR"/>
+        </w:rPr>
+        <w:t>λειτουργίες</w:t>
+      </w:r>
+      <w:r>
+        <w:rPr>
+          <w:lang w:val="el-GR"/>
+        </w:rPr>
+        <w:t xml:space="preserve"> </w:t>
       </w:r>
       <w:r>
         <w:t>Admin</w:t>
@@ -2418,23 +2979,557 @@
     </w:p>
     <w:p>
       <w:pPr>
+        <w:rPr>
+          <w:lang w:val="el-GR"/>
+        </w:rPr>
+      </w:pPr>
+      <w:r>
+        <w:rPr>
+          <w:lang w:val="el-GR"/>
+        </w:rPr>
+        <w:drawing>
+          <wp:anchor distT="0" distB="0" distL="114300" distR="114300" simplePos="0" relativeHeight="251666432" behindDoc="0" locked="0" layoutInCell="1" allowOverlap="1" wp14:anchorId="3C938BA9" wp14:editId="0361A14C">
+            <wp:simplePos x="0" y="0"/>
+            <wp:positionH relativeFrom="column">
+              <wp:posOffset>0</wp:posOffset>
+            </wp:positionH>
+            <wp:positionV relativeFrom="paragraph">
+              <wp:posOffset>78013</wp:posOffset>
+            </wp:positionV>
+            <wp:extent cx="1347470" cy="2708275"/>
+            <wp:effectExtent l="0" t="0" r="5080" b="0"/>
+            <wp:wrapThrough wrapText="bothSides">
+              <wp:wrapPolygon edited="0">
+                <wp:start x="0" y="0"/>
+                <wp:lineTo x="0" y="21423"/>
+                <wp:lineTo x="21376" y="21423"/>
+                <wp:lineTo x="21376" y="0"/>
+                <wp:lineTo x="0" y="0"/>
+              </wp:wrapPolygon>
+            </wp:wrapThrough>
+            <wp:docPr id="18" name="Picture 18"/>
+            <wp:cNvGraphicFramePr>
+              <a:graphicFrameLocks xmlns:a="http://schemas.openxmlformats.org/drawingml/2006/main" noChangeAspect="1"/>
+            </wp:cNvGraphicFramePr>
+            <a:graphic xmlns:a="http://schemas.openxmlformats.org/drawingml/2006/main">
+              <a:graphicData uri="http://schemas.openxmlformats.org/drawingml/2006/picture">
+                <pic:pic xmlns:pic="http://schemas.openxmlformats.org/drawingml/2006/picture">
+                  <pic:nvPicPr>
+                    <pic:cNvPr id="1" name=""/>
+                    <pic:cNvPicPr/>
+                  </pic:nvPicPr>
+                  <pic:blipFill>
+                    <a:blip r:embed="rId18" cstate="print">
+                      <a:extLst>
+                        <a:ext uri="{28A0092B-C50C-407E-A947-70E740481C1C}">
+                          <a14:useLocalDpi xmlns:a14="http://schemas.microsoft.com/office/drawing/2010/main" val="0"/>
+                        </a:ext>
+                      </a:extLst>
+                    </a:blip>
+                    <a:stretch>
+                      <a:fillRect/>
+                    </a:stretch>
+                  </pic:blipFill>
+                  <pic:spPr>
+                    <a:xfrm>
+                      <a:off x="0" y="0"/>
+                      <a:ext cx="1347470" cy="2708275"/>
+                    </a:xfrm>
+                    <a:prstGeom prst="rect">
+                      <a:avLst/>
+                    </a:prstGeom>
+                  </pic:spPr>
+                </pic:pic>
+              </a:graphicData>
+            </a:graphic>
+            <wp14:sizeRelH relativeFrom="margin">
+              <wp14:pctWidth>0</wp14:pctWidth>
+            </wp14:sizeRelH>
+            <wp14:sizeRelV relativeFrom="margin">
+              <wp14:pctHeight>0</wp14:pctHeight>
+            </wp14:sizeRelV>
+          </wp:anchor>
+        </w:drawing>
+      </w:r>
+      <w:r>
+        <w:rPr>
+          <w:lang w:val="el-GR"/>
+        </w:rPr>
+        <w:t xml:space="preserve">Ένας λογαριασμός τύπου </w:t>
+      </w:r>
+      <w:r>
+        <w:rPr>
+          <w:b/>
+        </w:rPr>
+        <w:t>Admin</w:t>
+      </w:r>
+      <w:r>
+        <w:rPr>
+          <w:lang w:val="el-GR"/>
+        </w:rPr>
+        <w:t xml:space="preserve">, </w:t>
+      </w:r>
+      <w:r>
+        <w:rPr>
+          <w:lang w:val="el-GR"/>
+        </w:rPr>
+        <w:t>πέρα από τις λειτουργίες που έχουν οι υπόλοιποι χρήστες, έχουν και</w:t>
+      </w:r>
+      <w:r>
+        <w:rPr>
+          <w:lang w:val="el-GR"/>
+        </w:rPr>
+        <w:t xml:space="preserve"> δύο επιπλέον λειτουργίες, που φαίνονται ως καινούργια μενού στο </w:t>
+      </w:r>
+      <w:r>
+        <w:t>Sidebar</w:t>
+      </w:r>
+      <w:r>
+        <w:rPr>
+          <w:lang w:val="el-GR"/>
+        </w:rPr>
+        <w:t xml:space="preserve"> </w:t>
+      </w:r>
+      <w:r>
+        <w:rPr>
+          <w:lang w:val="el-GR"/>
+        </w:rPr>
+        <w:t xml:space="preserve">του </w:t>
+      </w:r>
+      <w:r>
+        <w:t>Dashboard</w:t>
+      </w:r>
+      <w:r>
+        <w:rPr>
+          <w:lang w:val="el-GR"/>
+        </w:rPr>
+        <w:t xml:space="preserve"> </w:t>
+      </w:r>
+      <w:r>
+        <w:rPr>
+          <w:lang w:val="el-GR"/>
+        </w:rPr>
+        <w:t>(στο αριστερό μέρος της οθόνης)</w:t>
+      </w:r>
+      <w:r>
+        <w:rPr>
+          <w:lang w:val="el-GR"/>
+        </w:rPr>
+        <w:t>.</w:t>
+      </w:r>
+    </w:p>
+    <w:p>
+      <w:pPr>
+        <w:rPr>
+          <w:lang w:val="el-GR"/>
+        </w:rPr>
+      </w:pPr>
+    </w:p>
+    <w:p>
+      <w:pPr>
+        <w:rPr>
+          <w:lang w:val="el-GR"/>
+        </w:rPr>
+      </w:pPr>
+      <w:r>
+        <w:rPr>
+          <w:lang w:val="el-GR"/>
+        </w:rPr>
+        <w:t xml:space="preserve">Για να γίνει ένας </w:t>
+      </w:r>
+      <w:r>
+        <w:rPr>
+          <w:lang w:val="el-GR"/>
+        </w:rPr>
+        <w:t xml:space="preserve">λογαριασμός </w:t>
+      </w:r>
+      <w:r>
+        <w:t>Admin</w:t>
+      </w:r>
+      <w:r>
+        <w:rPr>
+          <w:lang w:val="el-GR"/>
+        </w:rPr>
+        <w:t xml:space="preserve">, </w:t>
+      </w:r>
+      <w:r>
+        <w:rPr>
+          <w:lang w:val="el-GR"/>
+        </w:rPr>
+        <w:t xml:space="preserve">θα πρέπει το </w:t>
+      </w:r>
+      <w:r>
+        <w:t>email</w:t>
+      </w:r>
+      <w:r>
+        <w:rPr>
+          <w:lang w:val="el-GR"/>
+        </w:rPr>
+        <w:t xml:space="preserve"> </w:t>
+      </w:r>
+      <w:r>
+        <w:rPr>
+          <w:lang w:val="el-GR"/>
+        </w:rPr>
+        <w:t xml:space="preserve">του να καταλήγει σε </w:t>
+      </w:r>
+      <w:r>
+        <w:rPr>
+          <w:b/>
+          <w:lang w:val="el-GR"/>
+        </w:rPr>
+        <w:t>@</w:t>
+      </w:r>
+      <w:r>
+        <w:rPr>
+          <w:b/>
+        </w:rPr>
+        <w:t>admin</w:t>
+      </w:r>
+      <w:r>
+        <w:rPr>
+          <w:b/>
+          <w:lang w:val="el-GR"/>
+        </w:rPr>
+        <w:t>.</w:t>
+      </w:r>
+      <w:r>
+        <w:rPr>
+          <w:b/>
+        </w:rPr>
+        <w:t>com</w:t>
+      </w:r>
+      <w:r>
+        <w:rPr>
+          <w:lang w:val="el-GR"/>
+        </w:rPr>
+        <w:t>.</w:t>
+      </w:r>
+    </w:p>
+    <w:p>
+      <w:pPr>
+        <w:rPr>
+          <w:lang w:val="el-GR"/>
+        </w:rPr>
+      </w:pPr>
+    </w:p>
+    <w:p>
+      <w:pPr>
         <w:pStyle w:val="Heading3"/>
+        <w:rPr>
+          <w:lang w:val="el-GR"/>
+        </w:rPr>
       </w:pPr>
       <w:bookmarkStart w:id="11" w:name="_Toc196652891"/>
-      <w:r>
-        <w:t>Create User</w:t>
+    </w:p>
+    <w:p>
+      <w:pPr>
+        <w:pStyle w:val="Heading3"/>
+        <w:rPr>
+          <w:lang w:val="el-GR"/>
+        </w:rPr>
+      </w:pPr>
+    </w:p>
+    <w:p>
+      <w:pPr>
+        <w:pStyle w:val="Heading3"/>
+        <w:rPr>
+          <w:lang w:val="el-GR"/>
+        </w:rPr>
+      </w:pPr>
+    </w:p>
+    <w:p>
+      <w:pPr>
+        <w:pStyle w:val="Heading3"/>
+        <w:rPr>
+          <w:lang w:val="el-GR"/>
+        </w:rPr>
+      </w:pPr>
+    </w:p>
+    <w:p>
+      <w:pPr>
+        <w:rPr>
+          <w:lang w:val="el-GR"/>
+        </w:rPr>
+      </w:pPr>
+    </w:p>
+    <w:p>
+      <w:pPr>
+        <w:pStyle w:val="Heading3"/>
+        <w:rPr>
+          <w:lang w:val="el-GR"/>
+        </w:rPr>
+      </w:pPr>
+      <w:r>
+        <w:t>Create</w:t>
+      </w:r>
+      <w:r>
+        <w:rPr>
+          <w:lang w:val="el-GR"/>
+        </w:rPr>
+        <w:t xml:space="preserve"> </w:t>
+      </w:r>
+      <w:r>
+        <w:t>User</w:t>
       </w:r>
       <w:bookmarkEnd w:id="11"/>
     </w:p>
     <w:p>
       <w:pPr>
+        <w:rPr>
+          <w:lang w:val="el-GR"/>
+        </w:rPr>
+      </w:pPr>
+      <w:r>
+        <w:rPr>
+          <w:lang w:val="el-GR"/>
+        </w:rPr>
+        <w:drawing>
+          <wp:anchor distT="0" distB="0" distL="114300" distR="114300" simplePos="0" relativeHeight="251664384" behindDoc="0" locked="0" layoutInCell="1" allowOverlap="1" wp14:anchorId="62E36FE0" wp14:editId="4A47DA76">
+            <wp:simplePos x="0" y="0"/>
+            <wp:positionH relativeFrom="column">
+              <wp:posOffset>1743710</wp:posOffset>
+            </wp:positionH>
+            <wp:positionV relativeFrom="paragraph">
+              <wp:posOffset>211455</wp:posOffset>
+            </wp:positionV>
+            <wp:extent cx="2456815" cy="1685925"/>
+            <wp:effectExtent l="0" t="0" r="635" b="9525"/>
+            <wp:wrapTopAndBottom/>
+            <wp:docPr id="16" name="Picture 16"/>
+            <wp:cNvGraphicFramePr>
+              <a:graphicFrameLocks xmlns:a="http://schemas.openxmlformats.org/drawingml/2006/main" noChangeAspect="1"/>
+            </wp:cNvGraphicFramePr>
+            <a:graphic xmlns:a="http://schemas.openxmlformats.org/drawingml/2006/main">
+              <a:graphicData uri="http://schemas.openxmlformats.org/drawingml/2006/picture">
+                <pic:pic xmlns:pic="http://schemas.openxmlformats.org/drawingml/2006/picture">
+                  <pic:nvPicPr>
+                    <pic:cNvPr id="1" name=""/>
+                    <pic:cNvPicPr/>
+                  </pic:nvPicPr>
+                  <pic:blipFill>
+                    <a:blip r:embed="rId19" cstate="print">
+                      <a:extLst>
+                        <a:ext uri="{28A0092B-C50C-407E-A947-70E740481C1C}">
+                          <a14:useLocalDpi xmlns:a14="http://schemas.microsoft.com/office/drawing/2010/main" val="0"/>
+                        </a:ext>
+                      </a:extLst>
+                    </a:blip>
+                    <a:stretch>
+                      <a:fillRect/>
+                    </a:stretch>
+                  </pic:blipFill>
+                  <pic:spPr>
+                    <a:xfrm>
+                      <a:off x="0" y="0"/>
+                      <a:ext cx="2456815" cy="1685925"/>
+                    </a:xfrm>
+                    <a:prstGeom prst="rect">
+                      <a:avLst/>
+                    </a:prstGeom>
+                  </pic:spPr>
+                </pic:pic>
+              </a:graphicData>
+            </a:graphic>
+            <wp14:sizeRelH relativeFrom="margin">
+              <wp14:pctWidth>0</wp14:pctWidth>
+            </wp14:sizeRelH>
+            <wp14:sizeRelV relativeFrom="margin">
+              <wp14:pctHeight>0</wp14:pctHeight>
+            </wp14:sizeRelV>
+          </wp:anchor>
+        </w:drawing>
+      </w:r>
+      <w:r>
+        <w:rPr>
+          <w:lang w:val="el-GR"/>
+        </w:rPr>
+        <w:t xml:space="preserve">Ο κάθε </w:t>
+      </w:r>
+      <w:r>
+        <w:t>Admin</w:t>
+      </w:r>
+      <w:r>
+        <w:rPr>
+          <w:lang w:val="el-GR"/>
+        </w:rPr>
+        <w:t xml:space="preserve"> </w:t>
+      </w:r>
+      <w:r>
+        <w:rPr>
+          <w:lang w:val="el-GR"/>
+        </w:rPr>
+        <w:t xml:space="preserve">έχει </w:t>
+      </w:r>
+      <w:r>
+        <w:rPr>
+          <w:lang w:val="el-GR"/>
+        </w:rPr>
+        <w:t xml:space="preserve">την ιδιότητα δημιουργίας καινούργιου λογαριασμού μέσα από το </w:t>
+      </w:r>
+      <w:r>
+        <w:t>Dashboard</w:t>
+      </w:r>
+      <w:r>
+        <w:rPr>
+          <w:lang w:val="el-GR"/>
+        </w:rPr>
+        <w:t>:</w:t>
+      </w:r>
+    </w:p>
+    <w:p>
+      <w:pPr>
         <w:pStyle w:val="Heading3"/>
+        <w:rPr>
+          <w:lang w:val="el-GR"/>
+        </w:rPr>
       </w:pPr>
       <w:bookmarkStart w:id="12" w:name="_Toc196652892"/>
       <w:r>
-        <w:t>Delete User</w:t>
+        <w:t>Delete</w:t>
+      </w:r>
+      <w:r>
+        <w:rPr>
+          <w:lang w:val="el-GR"/>
+        </w:rPr>
+        <w:t xml:space="preserve"> </w:t>
+      </w:r>
+      <w:r>
+        <w:t>User</w:t>
       </w:r>
       <w:bookmarkEnd w:id="12"/>
+    </w:p>
+    <w:p>
+      <w:pPr>
+        <w:rPr>
+          <w:lang w:val="el-GR"/>
+        </w:rPr>
+      </w:pPr>
+      <w:r>
+        <w:rPr>
+          <w:lang w:val="el-GR"/>
+        </w:rPr>
+        <w:t xml:space="preserve">Οι </w:t>
+      </w:r>
+      <w:r>
+        <w:t>Admin</w:t>
+      </w:r>
+      <w:r>
+        <w:rPr>
+          <w:lang w:val="el-GR"/>
+        </w:rPr>
+        <w:t xml:space="preserve"> </w:t>
+      </w:r>
+      <w:r>
+        <w:rPr>
+          <w:lang w:val="el-GR"/>
+        </w:rPr>
+        <w:t xml:space="preserve">έχουν επίσης και την ικανότητα διαγραφής ενός λογαριασμού, δεδομένου ότι και αυτός δεν είναι </w:t>
+      </w:r>
+      <w:r>
+        <w:t>Admin</w:t>
+      </w:r>
+      <w:r>
+        <w:rPr>
+          <w:lang w:val="el-GR"/>
+        </w:rPr>
+        <w:t>:</w:t>
+      </w:r>
+    </w:p>
+    <w:p>
+      <w:pPr>
+        <w:rPr>
+          <w:lang w:val="el-GR"/>
+        </w:rPr>
+      </w:pPr>
+      <w:r>
+        <w:lastRenderedPageBreak/>
+        <w:drawing>
+          <wp:anchor distT="0" distB="0" distL="114300" distR="114300" simplePos="0" relativeHeight="251665408" behindDoc="0" locked="0" layoutInCell="1" allowOverlap="1">
+            <wp:simplePos x="0" y="0"/>
+            <wp:positionH relativeFrom="column">
+              <wp:posOffset>1165860</wp:posOffset>
+            </wp:positionH>
+            <wp:positionV relativeFrom="paragraph">
+              <wp:posOffset>635</wp:posOffset>
+            </wp:positionV>
+            <wp:extent cx="3611794" cy="3023334"/>
+            <wp:effectExtent l="0" t="0" r="8255" b="5715"/>
+            <wp:wrapTopAndBottom/>
+            <wp:docPr id="17" name="Picture 17"/>
+            <wp:cNvGraphicFramePr>
+              <a:graphicFrameLocks xmlns:a="http://schemas.openxmlformats.org/drawingml/2006/main" noChangeAspect="1"/>
+            </wp:cNvGraphicFramePr>
+            <a:graphic xmlns:a="http://schemas.openxmlformats.org/drawingml/2006/main">
+              <a:graphicData uri="http://schemas.openxmlformats.org/drawingml/2006/picture">
+                <pic:pic xmlns:pic="http://schemas.openxmlformats.org/drawingml/2006/picture">
+                  <pic:nvPicPr>
+                    <pic:cNvPr id="1" name=""/>
+                    <pic:cNvPicPr/>
+                  </pic:nvPicPr>
+                  <pic:blipFill>
+                    <a:blip r:embed="rId20">
+                      <a:extLst>
+                        <a:ext uri="{28A0092B-C50C-407E-A947-70E740481C1C}">
+                          <a14:useLocalDpi xmlns:a14="http://schemas.microsoft.com/office/drawing/2010/main" val="0"/>
+                        </a:ext>
+                      </a:extLst>
+                    </a:blip>
+                    <a:stretch>
+                      <a:fillRect/>
+                    </a:stretch>
+                  </pic:blipFill>
+                  <pic:spPr>
+                    <a:xfrm>
+                      <a:off x="0" y="0"/>
+                      <a:ext cx="3611794" cy="3023334"/>
+                    </a:xfrm>
+                    <a:prstGeom prst="rect">
+                      <a:avLst/>
+                    </a:prstGeom>
+                  </pic:spPr>
+                </pic:pic>
+              </a:graphicData>
+            </a:graphic>
+            <wp14:sizeRelH relativeFrom="page">
+              <wp14:pctWidth>0</wp14:pctWidth>
+            </wp14:sizeRelH>
+            <wp14:sizeRelV relativeFrom="page">
+              <wp14:pctHeight>0</wp14:pctHeight>
+            </wp14:sizeRelV>
+          </wp:anchor>
+        </w:drawing>
+      </w:r>
+      <w:r>
+        <w:rPr>
+          <w:lang w:val="el-GR"/>
+        </w:rPr>
+        <w:t>Το μενού προσφέρει την ικανότητα αναζήτησης ενός λογαριασμού, και η διαγραφή γίνεται πατώντας το κόκκινο εικονίδιο στα δεξιά του κάθε λογαριασμού.</w:t>
+      </w:r>
+      <w:r>
+        <w:rPr>
+          <w:lang w:val="el-GR"/>
+        </w:rPr>
+        <w:t xml:space="preserve"> Ένας λογαριασμός τύπου </w:t>
+      </w:r>
+      <w:r>
+        <w:rPr>
+          <w:b/>
+        </w:rPr>
+        <w:t>Admin</w:t>
+      </w:r>
+      <w:r>
+        <w:rPr>
+          <w:lang w:val="el-GR"/>
+        </w:rPr>
+        <w:t xml:space="preserve"> </w:t>
+      </w:r>
+      <w:r>
+        <w:rPr>
+          <w:lang w:val="el-GR"/>
+        </w:rPr>
+        <w:t>δεν μπορεί να διαγραφεί.</w:t>
+      </w:r>
     </w:p>
     <w:sectPr>
       <w:pgSz w:w="12240" w:h="15840"/>
@@ -2446,20 +3541,117 @@
 </w:document>
 </file>
 
+<file path=word/numbering.xml><?xml version="1.0" encoding="utf-8"?>
+<w:numbering xmlns:wpc="http://schemas.microsoft.com/office/word/2010/wordprocessingCanvas" xmlns:mc="http://schemas.openxmlformats.org/markup-compatibility/2006" xmlns:o="urn:schemas-microsoft-com:office:office" xmlns:r="http://schemas.openxmlformats.org/officeDocument/2006/relationships" xmlns:m="http://schemas.openxmlformats.org/officeDocument/2006/math" xmlns:v="urn:schemas-microsoft-com:vml" xmlns:wp14="http://schemas.microsoft.com/office/word/2010/wordprocessingDrawing" xmlns:wp="http://schemas.openxmlformats.org/drawingml/2006/wordprocessingDrawing" xmlns:w10="urn:schemas-microsoft-com:office:word" xmlns:w="http://schemas.openxmlformats.org/wordprocessingml/2006/main" xmlns:w14="http://schemas.microsoft.com/office/word/2010/wordml" xmlns:w15="http://schemas.microsoft.com/office/word/2012/wordml" xmlns:wpg="http://schemas.microsoft.com/office/word/2010/wordprocessingGroup" xmlns:wpi="http://schemas.microsoft.com/office/word/2010/wordprocessingInk" xmlns:wne="http://schemas.microsoft.com/office/word/2006/wordml" xmlns:wps="http://schemas.microsoft.com/office/word/2010/wordprocessingShape" mc:Ignorable="w14 w15 wp14">
+  <w:abstractNum w:abstractNumId="0">
+    <w:nsid w:val="3F26626A"/>
+    <w:multiLevelType w:val="hybridMultilevel"/>
+    <w:tmpl w:val="645ED89A"/>
+    <w:lvl w:ilvl="0" w:tplc="04090011">
+      <w:start w:val="1"/>
+      <w:numFmt w:val="decimal"/>
+      <w:lvlText w:val="%1)"/>
+      <w:lvlJc w:val="left"/>
+      <w:pPr>
+        <w:ind w:left="720" w:hanging="360"/>
+      </w:pPr>
+      <w:rPr>
+        <w:rFonts w:hint="default"/>
+      </w:rPr>
+    </w:lvl>
+    <w:lvl w:ilvl="1" w:tplc="04090019" w:tentative="1">
+      <w:start w:val="1"/>
+      <w:numFmt w:val="lowerLetter"/>
+      <w:lvlText w:val="%2."/>
+      <w:lvlJc w:val="left"/>
+      <w:pPr>
+        <w:ind w:left="1440" w:hanging="360"/>
+      </w:pPr>
+    </w:lvl>
+    <w:lvl w:ilvl="2" w:tplc="0409001B" w:tentative="1">
+      <w:start w:val="1"/>
+      <w:numFmt w:val="lowerRoman"/>
+      <w:lvlText w:val="%3."/>
+      <w:lvlJc w:val="right"/>
+      <w:pPr>
+        <w:ind w:left="2160" w:hanging="180"/>
+      </w:pPr>
+    </w:lvl>
+    <w:lvl w:ilvl="3" w:tplc="0409000F" w:tentative="1">
+      <w:start w:val="1"/>
+      <w:numFmt w:val="decimal"/>
+      <w:lvlText w:val="%4."/>
+      <w:lvlJc w:val="left"/>
+      <w:pPr>
+        <w:ind w:left="2880" w:hanging="360"/>
+      </w:pPr>
+    </w:lvl>
+    <w:lvl w:ilvl="4" w:tplc="04090019" w:tentative="1">
+      <w:start w:val="1"/>
+      <w:numFmt w:val="lowerLetter"/>
+      <w:lvlText w:val="%5."/>
+      <w:lvlJc w:val="left"/>
+      <w:pPr>
+        <w:ind w:left="3600" w:hanging="360"/>
+      </w:pPr>
+    </w:lvl>
+    <w:lvl w:ilvl="5" w:tplc="0409001B" w:tentative="1">
+      <w:start w:val="1"/>
+      <w:numFmt w:val="lowerRoman"/>
+      <w:lvlText w:val="%6."/>
+      <w:lvlJc w:val="right"/>
+      <w:pPr>
+        <w:ind w:left="4320" w:hanging="180"/>
+      </w:pPr>
+    </w:lvl>
+    <w:lvl w:ilvl="6" w:tplc="0409000F" w:tentative="1">
+      <w:start w:val="1"/>
+      <w:numFmt w:val="decimal"/>
+      <w:lvlText w:val="%7."/>
+      <w:lvlJc w:val="left"/>
+      <w:pPr>
+        <w:ind w:left="5040" w:hanging="360"/>
+      </w:pPr>
+    </w:lvl>
+    <w:lvl w:ilvl="7" w:tplc="04090019" w:tentative="1">
+      <w:start w:val="1"/>
+      <w:numFmt w:val="lowerLetter"/>
+      <w:lvlText w:val="%8."/>
+      <w:lvlJc w:val="left"/>
+      <w:pPr>
+        <w:ind w:left="5760" w:hanging="360"/>
+      </w:pPr>
+    </w:lvl>
+    <w:lvl w:ilvl="8" w:tplc="0409001B" w:tentative="1">
+      <w:start w:val="1"/>
+      <w:numFmt w:val="lowerRoman"/>
+      <w:lvlText w:val="%9."/>
+      <w:lvlJc w:val="right"/>
+      <w:pPr>
+        <w:ind w:left="6480" w:hanging="180"/>
+      </w:pPr>
+    </w:lvl>
+  </w:abstractNum>
+  <w:num w:numId="1">
+    <w:abstractNumId w:val="0"/>
+  </w:num>
+</w:numbering>
+</file>
+
 <file path=word/styles.xml><?xml version="1.0" encoding="utf-8"?>
 <w:styles xmlns:mc="http://schemas.openxmlformats.org/markup-compatibility/2006" xmlns:r="http://schemas.openxmlformats.org/officeDocument/2006/relationships" xmlns:w="http://schemas.openxmlformats.org/wordprocessingml/2006/main" xmlns:w14="http://schemas.microsoft.com/office/word/2010/wordml" xmlns:w15="http://schemas.microsoft.com/office/word/2012/wordml" mc:Ignorable="w14 w15">
   <w:docDefaults>
     <w:rPrDefault>
       <w:rPr>
-        <w:rFonts w:asciiTheme="minorHAnsi" w:eastAsiaTheme="minorHAnsi" w:hAnsiTheme="minorHAnsi" w:cstheme="minorBidi"/>
-        <w:sz w:val="22"/>
-        <w:szCs w:val="22"/>
+        <w:rFonts w:asciiTheme="minorHAnsi" w:eastAsiaTheme="minorEastAsia" w:hAnsiTheme="minorHAnsi" w:cstheme="minorBidi"/>
+        <w:sz w:val="21"/>
+        <w:szCs w:val="21"/>
         <w:lang w:val="en-US" w:eastAsia="en-US" w:bidi="ar-SA"/>
       </w:rPr>
     </w:rPrDefault>
     <w:pPrDefault>
       <w:pPr>
-        <w:spacing w:after="160" w:line="259" w:lineRule="auto"/>
+        <w:spacing w:after="160" w:line="276" w:lineRule="auto"/>
       </w:pPr>
     </w:pPrDefault>
   </w:docDefaults>
@@ -2839,6 +4031,7 @@
   <w:style w:type="paragraph" w:default="1" w:styleId="Normal">
     <w:name w:val="Normal"/>
     <w:qFormat/>
+    <w:rsid w:val="00A60419"/>
   </w:style>
   <w:style w:type="paragraph" w:styleId="Heading1">
     <w:name w:val="heading 1"/>
@@ -2847,18 +4040,21 @@
     <w:link w:val="Heading1Char"/>
     <w:uiPriority w:val="9"/>
     <w:qFormat/>
-    <w:rsid w:val="00AC5196"/>
+    <w:rsid w:val="00A60419"/>
     <w:pPr>
       <w:keepNext/>
       <w:keepLines/>
-      <w:spacing w:before="240" w:after="0"/>
+      <w:pBdr>
+        <w:bottom w:val="single" w:sz="4" w:space="2" w:color="ED7D31" w:themeColor="accent2"/>
+      </w:pBdr>
+      <w:spacing w:before="360" w:after="120" w:line="240" w:lineRule="auto"/>
       <w:outlineLvl w:val="0"/>
     </w:pPr>
     <w:rPr>
       <w:rFonts w:asciiTheme="majorHAnsi" w:eastAsiaTheme="majorEastAsia" w:hAnsiTheme="majorHAnsi" w:cstheme="majorBidi"/>
-      <w:color w:val="2E74B5" w:themeColor="accent1" w:themeShade="BF"/>
-      <w:sz w:val="32"/>
-      <w:szCs w:val="32"/>
+      <w:color w:val="262626" w:themeColor="text1" w:themeTint="D9"/>
+      <w:sz w:val="40"/>
+      <w:szCs w:val="40"/>
     </w:rPr>
   </w:style>
   <w:style w:type="paragraph" w:styleId="Heading2">
@@ -2869,18 +4065,18 @@
     <w:uiPriority w:val="9"/>
     <w:unhideWhenUsed/>
     <w:qFormat/>
-    <w:rsid w:val="004E7B29"/>
+    <w:rsid w:val="00A60419"/>
     <w:pPr>
       <w:keepNext/>
       <w:keepLines/>
-      <w:spacing w:before="40" w:after="0"/>
+      <w:spacing w:before="120" w:after="0" w:line="240" w:lineRule="auto"/>
       <w:outlineLvl w:val="1"/>
     </w:pPr>
     <w:rPr>
       <w:rFonts w:asciiTheme="majorHAnsi" w:eastAsiaTheme="majorEastAsia" w:hAnsiTheme="majorHAnsi" w:cstheme="majorBidi"/>
-      <w:color w:val="2E74B5" w:themeColor="accent1" w:themeShade="BF"/>
-      <w:sz w:val="26"/>
-      <w:szCs w:val="26"/>
+      <w:color w:val="ED7D31" w:themeColor="accent2"/>
+      <w:sz w:val="36"/>
+      <w:szCs w:val="36"/>
     </w:rPr>
   </w:style>
   <w:style w:type="paragraph" w:styleId="Heading3">
@@ -2891,18 +4087,164 @@
     <w:uiPriority w:val="9"/>
     <w:unhideWhenUsed/>
     <w:qFormat/>
-    <w:rsid w:val="004E7B29"/>
+    <w:rsid w:val="00A60419"/>
     <w:pPr>
       <w:keepNext/>
       <w:keepLines/>
-      <w:spacing w:before="40" w:after="0"/>
+      <w:spacing w:before="80" w:after="0" w:line="240" w:lineRule="auto"/>
       <w:outlineLvl w:val="2"/>
     </w:pPr>
     <w:rPr>
       <w:rFonts w:asciiTheme="majorHAnsi" w:eastAsiaTheme="majorEastAsia" w:hAnsiTheme="majorHAnsi" w:cstheme="majorBidi"/>
-      <w:color w:val="1F4D78" w:themeColor="accent1" w:themeShade="7F"/>
+      <w:color w:val="C45911" w:themeColor="accent2" w:themeShade="BF"/>
+      <w:sz w:val="32"/>
+      <w:szCs w:val="32"/>
+    </w:rPr>
+  </w:style>
+  <w:style w:type="paragraph" w:styleId="Heading4">
+    <w:name w:val="heading 4"/>
+    <w:basedOn w:val="Normal"/>
+    <w:next w:val="Normal"/>
+    <w:link w:val="Heading4Char"/>
+    <w:uiPriority w:val="9"/>
+    <w:semiHidden/>
+    <w:unhideWhenUsed/>
+    <w:qFormat/>
+    <w:rsid w:val="00A60419"/>
+    <w:pPr>
+      <w:keepNext/>
+      <w:keepLines/>
+      <w:spacing w:before="80" w:after="0" w:line="240" w:lineRule="auto"/>
+      <w:outlineLvl w:val="3"/>
+    </w:pPr>
+    <w:rPr>
+      <w:rFonts w:asciiTheme="majorHAnsi" w:eastAsiaTheme="majorEastAsia" w:hAnsiTheme="majorHAnsi" w:cstheme="majorBidi"/>
+      <w:i/>
+      <w:iCs/>
+      <w:color w:val="833C0B" w:themeColor="accent2" w:themeShade="80"/>
+      <w:sz w:val="28"/>
+      <w:szCs w:val="28"/>
+    </w:rPr>
+  </w:style>
+  <w:style w:type="paragraph" w:styleId="Heading5">
+    <w:name w:val="heading 5"/>
+    <w:basedOn w:val="Normal"/>
+    <w:next w:val="Normal"/>
+    <w:link w:val="Heading5Char"/>
+    <w:uiPriority w:val="9"/>
+    <w:semiHidden/>
+    <w:unhideWhenUsed/>
+    <w:qFormat/>
+    <w:rsid w:val="00A60419"/>
+    <w:pPr>
+      <w:keepNext/>
+      <w:keepLines/>
+      <w:spacing w:before="80" w:after="0" w:line="240" w:lineRule="auto"/>
+      <w:outlineLvl w:val="4"/>
+    </w:pPr>
+    <w:rPr>
+      <w:rFonts w:asciiTheme="majorHAnsi" w:eastAsiaTheme="majorEastAsia" w:hAnsiTheme="majorHAnsi" w:cstheme="majorBidi"/>
+      <w:color w:val="C45911" w:themeColor="accent2" w:themeShade="BF"/>
       <w:sz w:val="24"/>
       <w:szCs w:val="24"/>
+    </w:rPr>
+  </w:style>
+  <w:style w:type="paragraph" w:styleId="Heading6">
+    <w:name w:val="heading 6"/>
+    <w:basedOn w:val="Normal"/>
+    <w:next w:val="Normal"/>
+    <w:link w:val="Heading6Char"/>
+    <w:uiPriority w:val="9"/>
+    <w:semiHidden/>
+    <w:unhideWhenUsed/>
+    <w:qFormat/>
+    <w:rsid w:val="00A60419"/>
+    <w:pPr>
+      <w:keepNext/>
+      <w:keepLines/>
+      <w:spacing w:before="80" w:after="0" w:line="240" w:lineRule="auto"/>
+      <w:outlineLvl w:val="5"/>
+    </w:pPr>
+    <w:rPr>
+      <w:rFonts w:asciiTheme="majorHAnsi" w:eastAsiaTheme="majorEastAsia" w:hAnsiTheme="majorHAnsi" w:cstheme="majorBidi"/>
+      <w:i/>
+      <w:iCs/>
+      <w:color w:val="833C0B" w:themeColor="accent2" w:themeShade="80"/>
+      <w:sz w:val="24"/>
+      <w:szCs w:val="24"/>
+    </w:rPr>
+  </w:style>
+  <w:style w:type="paragraph" w:styleId="Heading7">
+    <w:name w:val="heading 7"/>
+    <w:basedOn w:val="Normal"/>
+    <w:next w:val="Normal"/>
+    <w:link w:val="Heading7Char"/>
+    <w:uiPriority w:val="9"/>
+    <w:semiHidden/>
+    <w:unhideWhenUsed/>
+    <w:qFormat/>
+    <w:rsid w:val="00A60419"/>
+    <w:pPr>
+      <w:keepNext/>
+      <w:keepLines/>
+      <w:spacing w:before="80" w:after="0" w:line="240" w:lineRule="auto"/>
+      <w:outlineLvl w:val="6"/>
+    </w:pPr>
+    <w:rPr>
+      <w:rFonts w:asciiTheme="majorHAnsi" w:eastAsiaTheme="majorEastAsia" w:hAnsiTheme="majorHAnsi" w:cstheme="majorBidi"/>
+      <w:b/>
+      <w:bCs/>
+      <w:color w:val="833C0B" w:themeColor="accent2" w:themeShade="80"/>
+      <w:sz w:val="22"/>
+      <w:szCs w:val="22"/>
+    </w:rPr>
+  </w:style>
+  <w:style w:type="paragraph" w:styleId="Heading8">
+    <w:name w:val="heading 8"/>
+    <w:basedOn w:val="Normal"/>
+    <w:next w:val="Normal"/>
+    <w:link w:val="Heading8Char"/>
+    <w:uiPriority w:val="9"/>
+    <w:semiHidden/>
+    <w:unhideWhenUsed/>
+    <w:qFormat/>
+    <w:rsid w:val="00A60419"/>
+    <w:pPr>
+      <w:keepNext/>
+      <w:keepLines/>
+      <w:spacing w:before="80" w:after="0" w:line="240" w:lineRule="auto"/>
+      <w:outlineLvl w:val="7"/>
+    </w:pPr>
+    <w:rPr>
+      <w:rFonts w:asciiTheme="majorHAnsi" w:eastAsiaTheme="majorEastAsia" w:hAnsiTheme="majorHAnsi" w:cstheme="majorBidi"/>
+      <w:color w:val="833C0B" w:themeColor="accent2" w:themeShade="80"/>
+      <w:sz w:val="22"/>
+      <w:szCs w:val="22"/>
+    </w:rPr>
+  </w:style>
+  <w:style w:type="paragraph" w:styleId="Heading9">
+    <w:name w:val="heading 9"/>
+    <w:basedOn w:val="Normal"/>
+    <w:next w:val="Normal"/>
+    <w:link w:val="Heading9Char"/>
+    <w:uiPriority w:val="9"/>
+    <w:semiHidden/>
+    <w:unhideWhenUsed/>
+    <w:qFormat/>
+    <w:rsid w:val="00A60419"/>
+    <w:pPr>
+      <w:keepNext/>
+      <w:keepLines/>
+      <w:spacing w:before="80" w:after="0" w:line="240" w:lineRule="auto"/>
+      <w:outlineLvl w:val="8"/>
+    </w:pPr>
+    <w:rPr>
+      <w:rFonts w:asciiTheme="majorHAnsi" w:eastAsiaTheme="majorEastAsia" w:hAnsiTheme="majorHAnsi" w:cstheme="majorBidi"/>
+      <w:i/>
+      <w:iCs/>
+      <w:color w:val="833C0B" w:themeColor="accent2" w:themeShade="80"/>
+      <w:sz w:val="22"/>
+      <w:szCs w:val="22"/>
     </w:rPr>
   </w:style>
   <w:style w:type="character" w:default="1" w:styleId="DefaultParagraphFont">
@@ -2939,17 +4281,16 @@
     <w:link w:val="TitleChar"/>
     <w:uiPriority w:val="10"/>
     <w:qFormat/>
-    <w:rsid w:val="00AC5196"/>
+    <w:rsid w:val="00A60419"/>
     <w:pPr>
       <w:spacing w:after="0" w:line="240" w:lineRule="auto"/>
       <w:contextualSpacing/>
     </w:pPr>
     <w:rPr>
       <w:rFonts w:asciiTheme="majorHAnsi" w:eastAsiaTheme="majorEastAsia" w:hAnsiTheme="majorHAnsi" w:cstheme="majorBidi"/>
-      <w:spacing w:val="-10"/>
-      <w:kern w:val="28"/>
-      <w:sz w:val="56"/>
-      <w:szCs w:val="56"/>
+      <w:color w:val="262626" w:themeColor="text1" w:themeTint="D9"/>
+      <w:sz w:val="96"/>
+      <w:szCs w:val="96"/>
     </w:rPr>
   </w:style>
   <w:style w:type="character" w:customStyle="1" w:styleId="TitleChar">
@@ -2957,13 +4298,12 @@
     <w:basedOn w:val="DefaultParagraphFont"/>
     <w:link w:val="Title"/>
     <w:uiPriority w:val="10"/>
-    <w:rsid w:val="00AC5196"/>
+    <w:rsid w:val="00A60419"/>
     <w:rPr>
       <w:rFonts w:asciiTheme="majorHAnsi" w:eastAsiaTheme="majorEastAsia" w:hAnsiTheme="majorHAnsi" w:cstheme="majorBidi"/>
-      <w:spacing w:val="-10"/>
-      <w:kern w:val="28"/>
-      <w:sz w:val="56"/>
-      <w:szCs w:val="56"/>
+      <w:color w:val="262626" w:themeColor="text1" w:themeTint="D9"/>
+      <w:sz w:val="96"/>
+      <w:szCs w:val="96"/>
     </w:rPr>
   </w:style>
   <w:style w:type="character" w:customStyle="1" w:styleId="Heading1Char">
@@ -2971,12 +4311,12 @@
     <w:basedOn w:val="DefaultParagraphFont"/>
     <w:link w:val="Heading1"/>
     <w:uiPriority w:val="9"/>
-    <w:rsid w:val="00AC5196"/>
+    <w:rsid w:val="00A60419"/>
     <w:rPr>
       <w:rFonts w:asciiTheme="majorHAnsi" w:eastAsiaTheme="majorEastAsia" w:hAnsiTheme="majorHAnsi" w:cstheme="majorBidi"/>
-      <w:color w:val="2E74B5" w:themeColor="accent1" w:themeShade="BF"/>
-      <w:sz w:val="32"/>
-      <w:szCs w:val="32"/>
+      <w:color w:val="262626" w:themeColor="text1" w:themeTint="D9"/>
+      <w:sz w:val="40"/>
+      <w:szCs w:val="40"/>
     </w:rPr>
   </w:style>
   <w:style w:type="paragraph" w:styleId="TOCHeading">
@@ -2986,7 +4326,7 @@
     <w:uiPriority w:val="39"/>
     <w:unhideWhenUsed/>
     <w:qFormat/>
-    <w:rsid w:val="00AC5196"/>
+    <w:rsid w:val="00A60419"/>
     <w:pPr>
       <w:outlineLvl w:val="9"/>
     </w:pPr>
@@ -3019,12 +4359,12 @@
     <w:basedOn w:val="DefaultParagraphFont"/>
     <w:link w:val="Heading2"/>
     <w:uiPriority w:val="9"/>
-    <w:rsid w:val="004E7B29"/>
+    <w:rsid w:val="00A60419"/>
     <w:rPr>
       <w:rFonts w:asciiTheme="majorHAnsi" w:eastAsiaTheme="majorEastAsia" w:hAnsiTheme="majorHAnsi" w:cstheme="majorBidi"/>
-      <w:color w:val="2E74B5" w:themeColor="accent1" w:themeShade="BF"/>
-      <w:sz w:val="26"/>
-      <w:szCs w:val="26"/>
+      <w:color w:val="ED7D31" w:themeColor="accent2"/>
+      <w:sz w:val="36"/>
+      <w:szCs w:val="36"/>
     </w:rPr>
   </w:style>
   <w:style w:type="character" w:customStyle="1" w:styleId="Heading3Char">
@@ -3032,12 +4372,12 @@
     <w:basedOn w:val="DefaultParagraphFont"/>
     <w:link w:val="Heading3"/>
     <w:uiPriority w:val="9"/>
-    <w:rsid w:val="004E7B29"/>
+    <w:rsid w:val="00A60419"/>
     <w:rPr>
       <w:rFonts w:asciiTheme="majorHAnsi" w:eastAsiaTheme="majorEastAsia" w:hAnsiTheme="majorHAnsi" w:cstheme="majorBidi"/>
-      <w:color w:val="1F4D78" w:themeColor="accent1" w:themeShade="7F"/>
-      <w:sz w:val="24"/>
-      <w:szCs w:val="24"/>
+      <w:color w:val="C45911" w:themeColor="accent2" w:themeShade="BF"/>
+      <w:sz w:val="32"/>
+      <w:szCs w:val="32"/>
     </w:rPr>
   </w:style>
   <w:style w:type="paragraph" w:styleId="TOC2">
@@ -3065,6 +4405,338 @@
       <w:spacing w:after="100"/>
       <w:ind w:left="440"/>
     </w:pPr>
+  </w:style>
+  <w:style w:type="paragraph" w:styleId="ListParagraph">
+    <w:name w:val="List Paragraph"/>
+    <w:basedOn w:val="Normal"/>
+    <w:uiPriority w:val="34"/>
+    <w:qFormat/>
+    <w:rsid w:val="00A152F1"/>
+    <w:pPr>
+      <w:ind w:left="720"/>
+      <w:contextualSpacing/>
+    </w:pPr>
+  </w:style>
+  <w:style w:type="character" w:customStyle="1" w:styleId="Heading4Char">
+    <w:name w:val="Heading 4 Char"/>
+    <w:basedOn w:val="DefaultParagraphFont"/>
+    <w:link w:val="Heading4"/>
+    <w:uiPriority w:val="9"/>
+    <w:semiHidden/>
+    <w:rsid w:val="00A60419"/>
+    <w:rPr>
+      <w:rFonts w:asciiTheme="majorHAnsi" w:eastAsiaTheme="majorEastAsia" w:hAnsiTheme="majorHAnsi" w:cstheme="majorBidi"/>
+      <w:i/>
+      <w:iCs/>
+      <w:color w:val="833C0B" w:themeColor="accent2" w:themeShade="80"/>
+      <w:sz w:val="28"/>
+      <w:szCs w:val="28"/>
+    </w:rPr>
+  </w:style>
+  <w:style w:type="character" w:customStyle="1" w:styleId="Heading5Char">
+    <w:name w:val="Heading 5 Char"/>
+    <w:basedOn w:val="DefaultParagraphFont"/>
+    <w:link w:val="Heading5"/>
+    <w:uiPriority w:val="9"/>
+    <w:semiHidden/>
+    <w:rsid w:val="00A60419"/>
+    <w:rPr>
+      <w:rFonts w:asciiTheme="majorHAnsi" w:eastAsiaTheme="majorEastAsia" w:hAnsiTheme="majorHAnsi" w:cstheme="majorBidi"/>
+      <w:color w:val="C45911" w:themeColor="accent2" w:themeShade="BF"/>
+      <w:sz w:val="24"/>
+      <w:szCs w:val="24"/>
+    </w:rPr>
+  </w:style>
+  <w:style w:type="character" w:customStyle="1" w:styleId="Heading6Char">
+    <w:name w:val="Heading 6 Char"/>
+    <w:basedOn w:val="DefaultParagraphFont"/>
+    <w:link w:val="Heading6"/>
+    <w:uiPriority w:val="9"/>
+    <w:semiHidden/>
+    <w:rsid w:val="00A60419"/>
+    <w:rPr>
+      <w:rFonts w:asciiTheme="majorHAnsi" w:eastAsiaTheme="majorEastAsia" w:hAnsiTheme="majorHAnsi" w:cstheme="majorBidi"/>
+      <w:i/>
+      <w:iCs/>
+      <w:color w:val="833C0B" w:themeColor="accent2" w:themeShade="80"/>
+      <w:sz w:val="24"/>
+      <w:szCs w:val="24"/>
+    </w:rPr>
+  </w:style>
+  <w:style w:type="character" w:customStyle="1" w:styleId="Heading7Char">
+    <w:name w:val="Heading 7 Char"/>
+    <w:basedOn w:val="DefaultParagraphFont"/>
+    <w:link w:val="Heading7"/>
+    <w:uiPriority w:val="9"/>
+    <w:semiHidden/>
+    <w:rsid w:val="00A60419"/>
+    <w:rPr>
+      <w:rFonts w:asciiTheme="majorHAnsi" w:eastAsiaTheme="majorEastAsia" w:hAnsiTheme="majorHAnsi" w:cstheme="majorBidi"/>
+      <w:b/>
+      <w:bCs/>
+      <w:color w:val="833C0B" w:themeColor="accent2" w:themeShade="80"/>
+      <w:sz w:val="22"/>
+      <w:szCs w:val="22"/>
+    </w:rPr>
+  </w:style>
+  <w:style w:type="character" w:customStyle="1" w:styleId="Heading8Char">
+    <w:name w:val="Heading 8 Char"/>
+    <w:basedOn w:val="DefaultParagraphFont"/>
+    <w:link w:val="Heading8"/>
+    <w:uiPriority w:val="9"/>
+    <w:semiHidden/>
+    <w:rsid w:val="00A60419"/>
+    <w:rPr>
+      <w:rFonts w:asciiTheme="majorHAnsi" w:eastAsiaTheme="majorEastAsia" w:hAnsiTheme="majorHAnsi" w:cstheme="majorBidi"/>
+      <w:color w:val="833C0B" w:themeColor="accent2" w:themeShade="80"/>
+      <w:sz w:val="22"/>
+      <w:szCs w:val="22"/>
+    </w:rPr>
+  </w:style>
+  <w:style w:type="character" w:customStyle="1" w:styleId="Heading9Char">
+    <w:name w:val="Heading 9 Char"/>
+    <w:basedOn w:val="DefaultParagraphFont"/>
+    <w:link w:val="Heading9"/>
+    <w:uiPriority w:val="9"/>
+    <w:semiHidden/>
+    <w:rsid w:val="00A60419"/>
+    <w:rPr>
+      <w:rFonts w:asciiTheme="majorHAnsi" w:eastAsiaTheme="majorEastAsia" w:hAnsiTheme="majorHAnsi" w:cstheme="majorBidi"/>
+      <w:i/>
+      <w:iCs/>
+      <w:color w:val="833C0B" w:themeColor="accent2" w:themeShade="80"/>
+      <w:sz w:val="22"/>
+      <w:szCs w:val="22"/>
+    </w:rPr>
+  </w:style>
+  <w:style w:type="paragraph" w:styleId="Caption">
+    <w:name w:val="caption"/>
+    <w:basedOn w:val="Normal"/>
+    <w:next w:val="Normal"/>
+    <w:uiPriority w:val="35"/>
+    <w:semiHidden/>
+    <w:unhideWhenUsed/>
+    <w:qFormat/>
+    <w:rsid w:val="00A60419"/>
+    <w:pPr>
+      <w:spacing w:line="240" w:lineRule="auto"/>
+    </w:pPr>
+    <w:rPr>
+      <w:b/>
+      <w:bCs/>
+      <w:color w:val="404040" w:themeColor="text1" w:themeTint="BF"/>
+      <w:sz w:val="16"/>
+      <w:szCs w:val="16"/>
+    </w:rPr>
+  </w:style>
+  <w:style w:type="paragraph" w:styleId="Subtitle">
+    <w:name w:val="Subtitle"/>
+    <w:basedOn w:val="Normal"/>
+    <w:next w:val="Normal"/>
+    <w:link w:val="SubtitleChar"/>
+    <w:uiPriority w:val="11"/>
+    <w:qFormat/>
+    <w:rsid w:val="00A60419"/>
+    <w:pPr>
+      <w:numPr>
+        <w:ilvl w:val="1"/>
+      </w:numPr>
+      <w:spacing w:after="240"/>
+    </w:pPr>
+    <w:rPr>
+      <w:caps/>
+      <w:color w:val="404040" w:themeColor="text1" w:themeTint="BF"/>
+      <w:spacing w:val="20"/>
+      <w:sz w:val="28"/>
+      <w:szCs w:val="28"/>
+    </w:rPr>
+  </w:style>
+  <w:style w:type="character" w:customStyle="1" w:styleId="SubtitleChar">
+    <w:name w:val="Subtitle Char"/>
+    <w:basedOn w:val="DefaultParagraphFont"/>
+    <w:link w:val="Subtitle"/>
+    <w:uiPriority w:val="11"/>
+    <w:rsid w:val="00A60419"/>
+    <w:rPr>
+      <w:caps/>
+      <w:color w:val="404040" w:themeColor="text1" w:themeTint="BF"/>
+      <w:spacing w:val="20"/>
+      <w:sz w:val="28"/>
+      <w:szCs w:val="28"/>
+    </w:rPr>
+  </w:style>
+  <w:style w:type="character" w:styleId="Strong">
+    <w:name w:val="Strong"/>
+    <w:basedOn w:val="DefaultParagraphFont"/>
+    <w:uiPriority w:val="22"/>
+    <w:qFormat/>
+    <w:rsid w:val="00A60419"/>
+    <w:rPr>
+      <w:b/>
+      <w:bCs/>
+    </w:rPr>
+  </w:style>
+  <w:style w:type="character" w:styleId="Emphasis">
+    <w:name w:val="Emphasis"/>
+    <w:basedOn w:val="DefaultParagraphFont"/>
+    <w:uiPriority w:val="20"/>
+    <w:qFormat/>
+    <w:rsid w:val="00A60419"/>
+    <w:rPr>
+      <w:i/>
+      <w:iCs/>
+      <w:color w:val="000000" w:themeColor="text1"/>
+    </w:rPr>
+  </w:style>
+  <w:style w:type="paragraph" w:styleId="NoSpacing">
+    <w:name w:val="No Spacing"/>
+    <w:uiPriority w:val="1"/>
+    <w:qFormat/>
+    <w:rsid w:val="00A60419"/>
+    <w:pPr>
+      <w:spacing w:after="0" w:line="240" w:lineRule="auto"/>
+    </w:pPr>
+  </w:style>
+  <w:style w:type="paragraph" w:styleId="Quote">
+    <w:name w:val="Quote"/>
+    <w:basedOn w:val="Normal"/>
+    <w:next w:val="Normal"/>
+    <w:link w:val="QuoteChar"/>
+    <w:uiPriority w:val="29"/>
+    <w:qFormat/>
+    <w:rsid w:val="00A60419"/>
+    <w:pPr>
+      <w:spacing w:before="160"/>
+      <w:ind w:left="720" w:right="720"/>
+      <w:jc w:val="center"/>
+    </w:pPr>
+    <w:rPr>
+      <w:rFonts w:asciiTheme="majorHAnsi" w:eastAsiaTheme="majorEastAsia" w:hAnsiTheme="majorHAnsi" w:cstheme="majorBidi"/>
+      <w:color w:val="000000" w:themeColor="text1"/>
+      <w:sz w:val="24"/>
+      <w:szCs w:val="24"/>
+    </w:rPr>
+  </w:style>
+  <w:style w:type="character" w:customStyle="1" w:styleId="QuoteChar">
+    <w:name w:val="Quote Char"/>
+    <w:basedOn w:val="DefaultParagraphFont"/>
+    <w:link w:val="Quote"/>
+    <w:uiPriority w:val="29"/>
+    <w:rsid w:val="00A60419"/>
+    <w:rPr>
+      <w:rFonts w:asciiTheme="majorHAnsi" w:eastAsiaTheme="majorEastAsia" w:hAnsiTheme="majorHAnsi" w:cstheme="majorBidi"/>
+      <w:color w:val="000000" w:themeColor="text1"/>
+      <w:sz w:val="24"/>
+      <w:szCs w:val="24"/>
+    </w:rPr>
+  </w:style>
+  <w:style w:type="paragraph" w:styleId="IntenseQuote">
+    <w:name w:val="Intense Quote"/>
+    <w:basedOn w:val="Normal"/>
+    <w:next w:val="Normal"/>
+    <w:link w:val="IntenseQuoteChar"/>
+    <w:uiPriority w:val="30"/>
+    <w:qFormat/>
+    <w:rsid w:val="00A60419"/>
+    <w:pPr>
+      <w:pBdr>
+        <w:top w:val="single" w:sz="24" w:space="4" w:color="ED7D31" w:themeColor="accent2"/>
+      </w:pBdr>
+      <w:spacing w:before="240" w:after="240" w:line="240" w:lineRule="auto"/>
+      <w:ind w:left="936" w:right="936"/>
+      <w:jc w:val="center"/>
+    </w:pPr>
+    <w:rPr>
+      <w:rFonts w:asciiTheme="majorHAnsi" w:eastAsiaTheme="majorEastAsia" w:hAnsiTheme="majorHAnsi" w:cstheme="majorBidi"/>
+      <w:sz w:val="24"/>
+      <w:szCs w:val="24"/>
+    </w:rPr>
+  </w:style>
+  <w:style w:type="character" w:customStyle="1" w:styleId="IntenseQuoteChar">
+    <w:name w:val="Intense Quote Char"/>
+    <w:basedOn w:val="DefaultParagraphFont"/>
+    <w:link w:val="IntenseQuote"/>
+    <w:uiPriority w:val="30"/>
+    <w:rsid w:val="00A60419"/>
+    <w:rPr>
+      <w:rFonts w:asciiTheme="majorHAnsi" w:eastAsiaTheme="majorEastAsia" w:hAnsiTheme="majorHAnsi" w:cstheme="majorBidi"/>
+      <w:sz w:val="24"/>
+      <w:szCs w:val="24"/>
+    </w:rPr>
+  </w:style>
+  <w:style w:type="character" w:styleId="SubtleEmphasis">
+    <w:name w:val="Subtle Emphasis"/>
+    <w:basedOn w:val="DefaultParagraphFont"/>
+    <w:uiPriority w:val="19"/>
+    <w:qFormat/>
+    <w:rsid w:val="00A60419"/>
+    <w:rPr>
+      <w:i/>
+      <w:iCs/>
+      <w:color w:val="595959" w:themeColor="text1" w:themeTint="A6"/>
+    </w:rPr>
+  </w:style>
+  <w:style w:type="character" w:styleId="IntenseEmphasis">
+    <w:name w:val="Intense Emphasis"/>
+    <w:basedOn w:val="DefaultParagraphFont"/>
+    <w:uiPriority w:val="21"/>
+    <w:qFormat/>
+    <w:rsid w:val="00A60419"/>
+    <w:rPr>
+      <w:b/>
+      <w:bCs/>
+      <w:i/>
+      <w:iCs/>
+      <w:caps w:val="0"/>
+      <w:smallCaps w:val="0"/>
+      <w:strike w:val="0"/>
+      <w:dstrike w:val="0"/>
+      <w:color w:val="ED7D31" w:themeColor="accent2"/>
+    </w:rPr>
+  </w:style>
+  <w:style w:type="character" w:styleId="SubtleReference">
+    <w:name w:val="Subtle Reference"/>
+    <w:basedOn w:val="DefaultParagraphFont"/>
+    <w:uiPriority w:val="31"/>
+    <w:qFormat/>
+    <w:rsid w:val="00A60419"/>
+    <w:rPr>
+      <w:caps w:val="0"/>
+      <w:smallCaps/>
+      <w:color w:val="404040" w:themeColor="text1" w:themeTint="BF"/>
+      <w:spacing w:val="0"/>
+      <w:u w:val="single" w:color="7F7F7F" w:themeColor="text1" w:themeTint="80"/>
+    </w:rPr>
+  </w:style>
+  <w:style w:type="character" w:styleId="IntenseReference">
+    <w:name w:val="Intense Reference"/>
+    <w:basedOn w:val="DefaultParagraphFont"/>
+    <w:uiPriority w:val="32"/>
+    <w:qFormat/>
+    <w:rsid w:val="00A60419"/>
+    <w:rPr>
+      <w:b/>
+      <w:bCs/>
+      <w:caps w:val="0"/>
+      <w:smallCaps/>
+      <w:color w:val="auto"/>
+      <w:spacing w:val="0"/>
+      <w:u w:val="single"/>
+    </w:rPr>
+  </w:style>
+  <w:style w:type="character" w:styleId="BookTitle">
+    <w:name w:val="Book Title"/>
+    <w:basedOn w:val="DefaultParagraphFont"/>
+    <w:uiPriority w:val="33"/>
+    <w:qFormat/>
+    <w:rsid w:val="00A60419"/>
+    <w:rPr>
+      <w:b/>
+      <w:bCs/>
+      <w:caps w:val="0"/>
+      <w:smallCaps/>
+      <w:spacing w:val="0"/>
+    </w:rPr>
   </w:style>
 </w:styles>
 </file>
@@ -3335,7 +5007,7 @@
 </file>
 
 <file path=customXml/itemProps1.xml><?xml version="1.0" encoding="utf-8"?>
-<ds:datastoreItem xmlns:ds="http://schemas.openxmlformats.org/officeDocument/2006/customXml" ds:itemID="{4F075856-3CA3-4CF7-90D3-7763E9BA8E68}">
+<ds:datastoreItem xmlns:ds="http://schemas.openxmlformats.org/officeDocument/2006/customXml" ds:itemID="{86935D10-BC9C-45E6-9151-B0397B7422FC}">
   <ds:schemaRefs>
     <ds:schemaRef ds:uri="http://schemas.openxmlformats.org/officeDocument/2006/bibliography"/>
   </ds:schemaRefs>

</xml_diff>

<commit_message>
adding more images to manual
</commit_message>
<xml_diff>
--- a/User manual.docx
+++ b/User manual.docx
@@ -208,7 +208,7 @@
                 <w:noProof/>
                 <w:webHidden/>
               </w:rPr>
-              <w:t>3</w:t>
+              <w:t>2</w:t>
             </w:r>
             <w:r>
               <w:rPr>
@@ -277,7 +277,7 @@
                 <w:noProof/>
                 <w:webHidden/>
               </w:rPr>
-              <w:t>3</w:t>
+              <w:t>2</w:t>
             </w:r>
             <w:r>
               <w:rPr>
@@ -346,7 +346,7 @@
                 <w:noProof/>
                 <w:webHidden/>
               </w:rPr>
-              <w:t>4</w:t>
+              <w:t>3</w:t>
             </w:r>
             <w:r>
               <w:rPr>
@@ -618,7 +618,7 @@
                 <w:noProof/>
                 <w:webHidden/>
               </w:rPr>
-              <w:t>5</w:t>
+              <w:t>6</w:t>
             </w:r>
             <w:r>
               <w:rPr>
@@ -2329,16 +2329,7 @@
           <w:b/>
           <w:lang w:val="el-GR"/>
         </w:rPr>
-        <w:t>5</w:t>
-      </w:r>
-      <w:bookmarkStart w:id="7" w:name="_GoBack"/>
-      <w:bookmarkEnd w:id="7"/>
-      <w:r>
-        <w:rPr>
-          <w:b/>
-          <w:lang w:val="el-GR"/>
-        </w:rPr>
-        <w:t>0$</w:t>
+        <w:t>50$</w:t>
       </w:r>
       <w:r>
         <w:rPr>
@@ -2445,11 +2436,11 @@
       <w:pPr>
         <w:pStyle w:val="Heading2"/>
       </w:pPr>
-      <w:bookmarkStart w:id="8" w:name="_Toc196652888"/>
+      <w:bookmarkStart w:id="7" w:name="_Toc196652888"/>
       <w:r>
         <w:t>History</w:t>
       </w:r>
-      <w:bookmarkEnd w:id="8"/>
+      <w:bookmarkEnd w:id="7"/>
     </w:p>
     <w:p>
       <w:pPr>
@@ -2589,11 +2580,11 @@
       <w:pPr>
         <w:pStyle w:val="Heading2"/>
       </w:pPr>
-      <w:bookmarkStart w:id="9" w:name="_Toc196652889"/>
+      <w:bookmarkStart w:id="8" w:name="_Toc196652889"/>
       <w:r>
         <w:t>Statistics</w:t>
       </w:r>
-      <w:bookmarkEnd w:id="9"/>
+      <w:bookmarkEnd w:id="8"/>
     </w:p>
     <w:p>
       <w:pPr>
@@ -2656,6 +2647,81 @@
         </w:rPr>
         <w:t>Η αναλογία καταθέσεων προς όλες τις υπόλοιπες συναλλαγές</w:t>
       </w:r>
+      <w:r>
+        <w:rPr>
+          <w:lang w:val="el-GR"/>
+        </w:rPr>
+        <w:t>.</w:t>
+      </w:r>
+    </w:p>
+    <w:p>
+      <w:pPr>
+        <w:pStyle w:val="ListParagraph"/>
+        <w:rPr>
+          <w:lang w:val="el-GR"/>
+        </w:rPr>
+      </w:pPr>
+      <w:r>
+        <w:rPr>
+          <w:lang w:val="el-GR"/>
+        </w:rPr>
+        <w:lastRenderedPageBreak/>
+        <w:drawing>
+          <wp:anchor distT="0" distB="0" distL="114300" distR="114300" simplePos="0" relativeHeight="251667456" behindDoc="1" locked="0" layoutInCell="1" allowOverlap="1">
+            <wp:simplePos x="0" y="0"/>
+            <wp:positionH relativeFrom="column">
+              <wp:posOffset>1522095</wp:posOffset>
+            </wp:positionH>
+            <wp:positionV relativeFrom="paragraph">
+              <wp:posOffset>0</wp:posOffset>
+            </wp:positionV>
+            <wp:extent cx="2677795" cy="1648460"/>
+            <wp:effectExtent l="0" t="0" r="8255" b="8890"/>
+            <wp:wrapTopAndBottom/>
+            <wp:docPr id="20" name="Picture 20"/>
+            <wp:cNvGraphicFramePr>
+              <a:graphicFrameLocks xmlns:a="http://schemas.openxmlformats.org/drawingml/2006/main" noChangeAspect="1"/>
+            </wp:cNvGraphicFramePr>
+            <a:graphic xmlns:a="http://schemas.openxmlformats.org/drawingml/2006/main">
+              <a:graphicData uri="http://schemas.openxmlformats.org/drawingml/2006/picture">
+                <pic:pic xmlns:pic="http://schemas.openxmlformats.org/drawingml/2006/picture">
+                  <pic:nvPicPr>
+                    <pic:cNvPr id="1" name=""/>
+                    <pic:cNvPicPr/>
+                  </pic:nvPicPr>
+                  <pic:blipFill>
+                    <a:blip r:embed="rId18" cstate="print">
+                      <a:extLst>
+                        <a:ext uri="{28A0092B-C50C-407E-A947-70E740481C1C}">
+                          <a14:useLocalDpi xmlns:a14="http://schemas.microsoft.com/office/drawing/2010/main" val="0"/>
+                        </a:ext>
+                      </a:extLst>
+                    </a:blip>
+                    <a:stretch>
+                      <a:fillRect/>
+                    </a:stretch>
+                  </pic:blipFill>
+                  <pic:spPr>
+                    <a:xfrm>
+                      <a:off x="0" y="0"/>
+                      <a:ext cx="2677795" cy="1648460"/>
+                    </a:xfrm>
+                    <a:prstGeom prst="rect">
+                      <a:avLst/>
+                    </a:prstGeom>
+                  </pic:spPr>
+                </pic:pic>
+              </a:graphicData>
+            </a:graphic>
+            <wp14:sizeRelH relativeFrom="page">
+              <wp14:pctWidth>0</wp14:pctWidth>
+            </wp14:sizeRelH>
+            <wp14:sizeRelV relativeFrom="page">
+              <wp14:pctHeight>0</wp14:pctHeight>
+            </wp14:sizeRelV>
+          </wp:anchor>
+        </w:drawing>
+      </w:r>
     </w:p>
     <w:p>
       <w:pPr>
@@ -2699,6 +2765,88 @@
         </w:rPr>
         <w:t>Η αναλογία αναλήψεων προς όλες τις υπόλοιπες συναλλαγές</w:t>
       </w:r>
+      <w:r>
+        <w:rPr>
+          <w:lang w:val="el-GR"/>
+        </w:rPr>
+        <w:t>.</w:t>
+      </w:r>
+    </w:p>
+    <w:p>
+      <w:pPr>
+        <w:pStyle w:val="ListParagraph"/>
+        <w:rPr>
+          <w:lang w:val="el-GR"/>
+        </w:rPr>
+      </w:pPr>
+      <w:r>
+        <w:rPr>
+          <w:lang w:val="el-GR"/>
+        </w:rPr>
+        <w:drawing>
+          <wp:anchor distT="0" distB="0" distL="114300" distR="114300" simplePos="0" relativeHeight="251668480" behindDoc="0" locked="0" layoutInCell="1" allowOverlap="1" wp14:anchorId="440B6AE8" wp14:editId="05111CAD">
+            <wp:simplePos x="0" y="0"/>
+            <wp:positionH relativeFrom="column">
+              <wp:posOffset>1611630</wp:posOffset>
+            </wp:positionH>
+            <wp:positionV relativeFrom="paragraph">
+              <wp:posOffset>187325</wp:posOffset>
+            </wp:positionV>
+            <wp:extent cx="2719705" cy="1692275"/>
+            <wp:effectExtent l="0" t="0" r="4445" b="3175"/>
+            <wp:wrapTopAndBottom/>
+            <wp:docPr id="21" name="Picture 21"/>
+            <wp:cNvGraphicFramePr>
+              <a:graphicFrameLocks xmlns:a="http://schemas.openxmlformats.org/drawingml/2006/main" noChangeAspect="1"/>
+            </wp:cNvGraphicFramePr>
+            <a:graphic xmlns:a="http://schemas.openxmlformats.org/drawingml/2006/main">
+              <a:graphicData uri="http://schemas.openxmlformats.org/drawingml/2006/picture">
+                <pic:pic xmlns:pic="http://schemas.openxmlformats.org/drawingml/2006/picture">
+                  <pic:nvPicPr>
+                    <pic:cNvPr id="1" name=""/>
+                    <pic:cNvPicPr/>
+                  </pic:nvPicPr>
+                  <pic:blipFill>
+                    <a:blip r:embed="rId19" cstate="print">
+                      <a:extLst>
+                        <a:ext uri="{28A0092B-C50C-407E-A947-70E740481C1C}">
+                          <a14:useLocalDpi xmlns:a14="http://schemas.microsoft.com/office/drawing/2010/main" val="0"/>
+                        </a:ext>
+                      </a:extLst>
+                    </a:blip>
+                    <a:stretch>
+                      <a:fillRect/>
+                    </a:stretch>
+                  </pic:blipFill>
+                  <pic:spPr>
+                    <a:xfrm>
+                      <a:off x="0" y="0"/>
+                      <a:ext cx="2719705" cy="1692275"/>
+                    </a:xfrm>
+                    <a:prstGeom prst="rect">
+                      <a:avLst/>
+                    </a:prstGeom>
+                  </pic:spPr>
+                </pic:pic>
+              </a:graphicData>
+            </a:graphic>
+            <wp14:sizeRelH relativeFrom="page">
+              <wp14:pctWidth>0</wp14:pctWidth>
+            </wp14:sizeRelH>
+            <wp14:sizeRelV relativeFrom="page">
+              <wp14:pctHeight>0</wp14:pctHeight>
+            </wp14:sizeRelV>
+          </wp:anchor>
+        </w:drawing>
+      </w:r>
+    </w:p>
+    <w:p>
+      <w:pPr>
+        <w:pStyle w:val="ListParagraph"/>
+        <w:rPr>
+          <w:lang w:val="el-GR"/>
+        </w:rPr>
+      </w:pPr>
     </w:p>
     <w:p>
       <w:pPr>
@@ -2713,6 +2861,66 @@
       </w:pPr>
       <w:r>
         <w:rPr>
+          <w:lang w:val="el-GR"/>
+        </w:rPr>
+        <w:drawing>
+          <wp:anchor distT="0" distB="0" distL="114300" distR="114300" simplePos="0" relativeHeight="251669504" behindDoc="0" locked="0" layoutInCell="1" allowOverlap="1" wp14:anchorId="007DE903" wp14:editId="7960CF89">
+            <wp:simplePos x="0" y="0"/>
+            <wp:positionH relativeFrom="column">
+              <wp:posOffset>1611703</wp:posOffset>
+            </wp:positionH>
+            <wp:positionV relativeFrom="paragraph">
+              <wp:posOffset>184785</wp:posOffset>
+            </wp:positionV>
+            <wp:extent cx="2830830" cy="1765300"/>
+            <wp:effectExtent l="0" t="0" r="7620" b="6350"/>
+            <wp:wrapTopAndBottom/>
+            <wp:docPr id="22" name="Picture 22"/>
+            <wp:cNvGraphicFramePr>
+              <a:graphicFrameLocks xmlns:a="http://schemas.openxmlformats.org/drawingml/2006/main" noChangeAspect="1"/>
+            </wp:cNvGraphicFramePr>
+            <a:graphic xmlns:a="http://schemas.openxmlformats.org/drawingml/2006/main">
+              <a:graphicData uri="http://schemas.openxmlformats.org/drawingml/2006/picture">
+                <pic:pic xmlns:pic="http://schemas.openxmlformats.org/drawingml/2006/picture">
+                  <pic:nvPicPr>
+                    <pic:cNvPr id="1" name=""/>
+                    <pic:cNvPicPr/>
+                  </pic:nvPicPr>
+                  <pic:blipFill>
+                    <a:blip r:embed="rId20" cstate="print">
+                      <a:extLst>
+                        <a:ext uri="{28A0092B-C50C-407E-A947-70E740481C1C}">
+                          <a14:useLocalDpi xmlns:a14="http://schemas.microsoft.com/office/drawing/2010/main" val="0"/>
+                        </a:ext>
+                      </a:extLst>
+                    </a:blip>
+                    <a:stretch>
+                      <a:fillRect/>
+                    </a:stretch>
+                  </pic:blipFill>
+                  <pic:spPr>
+                    <a:xfrm>
+                      <a:off x="0" y="0"/>
+                      <a:ext cx="2830830" cy="1765300"/>
+                    </a:xfrm>
+                    <a:prstGeom prst="rect">
+                      <a:avLst/>
+                    </a:prstGeom>
+                  </pic:spPr>
+                </pic:pic>
+              </a:graphicData>
+            </a:graphic>
+            <wp14:sizeRelH relativeFrom="page">
+              <wp14:pctWidth>0</wp14:pctWidth>
+            </wp14:sizeRelH>
+            <wp14:sizeRelV relativeFrom="page">
+              <wp14:pctHeight>0</wp14:pctHeight>
+            </wp14:sizeRelV>
+          </wp:anchor>
+        </w:drawing>
+      </w:r>
+      <w:r>
+        <w:rPr>
           <w:b/>
         </w:rPr>
         <w:t>Transfers</w:t>
@@ -2746,8 +2954,30 @@
         <w:rPr>
           <w:lang w:val="el-GR"/>
         </w:rPr>
-        <w:t>Η αναλογία μεταφορών προς όλες τις υπόλοιπες συναλλαγές</w:t>
-      </w:r>
+        <w:t xml:space="preserve">Η </w:t>
+      </w:r>
+      <w:bookmarkStart w:id="9" w:name="_GoBack"/>
+      <w:bookmarkEnd w:id="9"/>
+      <w:r>
+        <w:rPr>
+          <w:lang w:val="el-GR"/>
+        </w:rPr>
+        <w:t>αναλογία μεταφορών προς όλες τις υπόλοιπες συναλλαγές</w:t>
+      </w:r>
+      <w:r>
+        <w:rPr>
+          <w:lang w:val="el-GR"/>
+        </w:rPr>
+        <w:t>.</w:t>
+      </w:r>
+    </w:p>
+    <w:p>
+      <w:pPr>
+        <w:pStyle w:val="ListParagraph"/>
+        <w:rPr>
+          <w:lang w:val="el-GR"/>
+        </w:rPr>
+      </w:pPr>
     </w:p>
     <w:p>
       <w:pPr>
@@ -2822,6 +3052,81 @@
         </w:rPr>
         <w:t>αναλογία ανάμεσα στις καταθέσεις και τις αναλήψεις</w:t>
       </w:r>
+      <w:r>
+        <w:rPr>
+          <w:lang w:val="el-GR"/>
+        </w:rPr>
+        <w:t>.</w:t>
+      </w:r>
+    </w:p>
+    <w:p>
+      <w:pPr>
+        <w:pStyle w:val="ListParagraph"/>
+        <w:rPr>
+          <w:lang w:val="el-GR"/>
+        </w:rPr>
+      </w:pPr>
+      <w:r>
+        <w:rPr>
+          <w:lang w:val="el-GR"/>
+        </w:rPr>
+        <w:lastRenderedPageBreak/>
+        <w:drawing>
+          <wp:anchor distT="0" distB="0" distL="114300" distR="114300" simplePos="0" relativeHeight="251670528" behindDoc="0" locked="0" layoutInCell="1" allowOverlap="1" wp14:anchorId="337AC138" wp14:editId="07535830">
+            <wp:simplePos x="0" y="0"/>
+            <wp:positionH relativeFrom="column">
+              <wp:posOffset>1571625</wp:posOffset>
+            </wp:positionH>
+            <wp:positionV relativeFrom="paragraph">
+              <wp:posOffset>192405</wp:posOffset>
+            </wp:positionV>
+            <wp:extent cx="2800985" cy="1753235"/>
+            <wp:effectExtent l="0" t="0" r="0" b="0"/>
+            <wp:wrapTopAndBottom/>
+            <wp:docPr id="23" name="Picture 23"/>
+            <wp:cNvGraphicFramePr>
+              <a:graphicFrameLocks xmlns:a="http://schemas.openxmlformats.org/drawingml/2006/main" noChangeAspect="1"/>
+            </wp:cNvGraphicFramePr>
+            <a:graphic xmlns:a="http://schemas.openxmlformats.org/drawingml/2006/main">
+              <a:graphicData uri="http://schemas.openxmlformats.org/drawingml/2006/picture">
+                <pic:pic xmlns:pic="http://schemas.openxmlformats.org/drawingml/2006/picture">
+                  <pic:nvPicPr>
+                    <pic:cNvPr id="1" name=""/>
+                    <pic:cNvPicPr/>
+                  </pic:nvPicPr>
+                  <pic:blipFill>
+                    <a:blip r:embed="rId21" cstate="print">
+                      <a:extLst>
+                        <a:ext uri="{28A0092B-C50C-407E-A947-70E740481C1C}">
+                          <a14:useLocalDpi xmlns:a14="http://schemas.microsoft.com/office/drawing/2010/main" val="0"/>
+                        </a:ext>
+                      </a:extLst>
+                    </a:blip>
+                    <a:stretch>
+                      <a:fillRect/>
+                    </a:stretch>
+                  </pic:blipFill>
+                  <pic:spPr>
+                    <a:xfrm>
+                      <a:off x="0" y="0"/>
+                      <a:ext cx="2800985" cy="1753235"/>
+                    </a:xfrm>
+                    <a:prstGeom prst="rect">
+                      <a:avLst/>
+                    </a:prstGeom>
+                  </pic:spPr>
+                </pic:pic>
+              </a:graphicData>
+            </a:graphic>
+            <wp14:sizeRelH relativeFrom="page">
+              <wp14:pctWidth>0</wp14:pctWidth>
+            </wp14:sizeRelH>
+            <wp14:sizeRelV relativeFrom="page">
+              <wp14:pctHeight>0</wp14:pctHeight>
+            </wp14:sizeRelV>
+          </wp:anchor>
+        </w:drawing>
+      </w:r>
     </w:p>
     <w:p>
       <w:pPr>
@@ -2838,7 +3143,6 @@
         <w:rPr>
           <w:b/>
         </w:rPr>
-        <w:lastRenderedPageBreak/>
         <w:t>Average</w:t>
       </w:r>
       <w:r>
@@ -2870,13 +3174,102 @@
         <w:rPr>
           <w:lang w:val="el-GR"/>
         </w:rPr>
-        <w:t xml:space="preserve">Μέσος όρος χρηματικού ποσού που συναλλάσεται, είτε σε αναλήψεις, είτε σε καταθέσεις, είτε σε μεταφορές. Ο αριθμός που αναγράφεται πάνω από το γράφημα είναι ο μέσος όρος σε αναλήψεις και καταθέσεις συνολικά </w:t>
+        <w:t>Μέσος όρος χρηματικού ποσού που συναλλά</w:t>
+      </w:r>
+      <w:r>
+        <w:rPr>
+          <w:lang w:val="el-GR"/>
+        </w:rPr>
+        <w:t>χτηκε</w:t>
+      </w:r>
+      <w:r>
+        <w:rPr>
+          <w:lang w:val="el-GR"/>
+        </w:rPr>
+        <w:t xml:space="preserve">, είτε σε αναλήψεις, είτε σε καταθέσεις, είτε σε μεταφορές. Ο αριθμός που αναγράφεται πάνω από το γράφημα είναι ο μέσος όρος σε αναλήψεις και καταθέσεις συνολικά </w:t>
       </w:r>
       <w:r>
         <w:rPr>
           <w:lang w:val="el-GR"/>
         </w:rPr>
         <w:t>σε όλη την ιστορία του λογαριασμού.</w:t>
+      </w:r>
+    </w:p>
+    <w:p>
+      <w:pPr>
+        <w:pStyle w:val="ListParagraph"/>
+        <w:rPr>
+          <w:lang w:val="el-GR"/>
+        </w:rPr>
+      </w:pPr>
+    </w:p>
+    <w:p>
+      <w:pPr>
+        <w:pStyle w:val="ListParagraph"/>
+        <w:rPr>
+          <w:b/>
+          <w:lang w:val="el-GR"/>
+        </w:rPr>
+      </w:pPr>
+      <w:r>
+        <w:rPr>
+          <w:lang w:val="el-GR"/>
+        </w:rPr>
+        <w:drawing>
+          <wp:anchor distT="0" distB="0" distL="114300" distR="114300" simplePos="0" relativeHeight="251671552" behindDoc="0" locked="0" layoutInCell="1" allowOverlap="1">
+            <wp:simplePos x="0" y="0"/>
+            <wp:positionH relativeFrom="column">
+              <wp:posOffset>1487805</wp:posOffset>
+            </wp:positionH>
+            <wp:positionV relativeFrom="paragraph">
+              <wp:posOffset>1270</wp:posOffset>
+            </wp:positionV>
+            <wp:extent cx="2968023" cy="1834086"/>
+            <wp:effectExtent l="0" t="0" r="3810" b="0"/>
+            <wp:wrapTopAndBottom/>
+            <wp:docPr id="24" name="Picture 24"/>
+            <wp:cNvGraphicFramePr>
+              <a:graphicFrameLocks xmlns:a="http://schemas.openxmlformats.org/drawingml/2006/main" noChangeAspect="1"/>
+            </wp:cNvGraphicFramePr>
+            <a:graphic xmlns:a="http://schemas.openxmlformats.org/drawingml/2006/main">
+              <a:graphicData uri="http://schemas.openxmlformats.org/drawingml/2006/picture">
+                <pic:pic xmlns:pic="http://schemas.openxmlformats.org/drawingml/2006/picture">
+                  <pic:nvPicPr>
+                    <pic:cNvPr id="1" name=""/>
+                    <pic:cNvPicPr/>
+                  </pic:nvPicPr>
+                  <pic:blipFill>
+                    <a:blip r:embed="rId22">
+                      <a:extLst>
+                        <a:ext uri="{28A0092B-C50C-407E-A947-70E740481C1C}">
+                          <a14:useLocalDpi xmlns:a14="http://schemas.microsoft.com/office/drawing/2010/main" val="0"/>
+                        </a:ext>
+                      </a:extLst>
+                    </a:blip>
+                    <a:stretch>
+                      <a:fillRect/>
+                    </a:stretch>
+                  </pic:blipFill>
+                  <pic:spPr>
+                    <a:xfrm>
+                      <a:off x="0" y="0"/>
+                      <a:ext cx="2968023" cy="1834086"/>
+                    </a:xfrm>
+                    <a:prstGeom prst="rect">
+                      <a:avLst/>
+                    </a:prstGeom>
+                  </pic:spPr>
+                </pic:pic>
+              </a:graphicData>
+            </a:graphic>
+            <wp14:sizeRelH relativeFrom="page">
+              <wp14:pctWidth>0</wp14:pctWidth>
+            </wp14:sizeRelH>
+            <wp14:sizeRelV relativeFrom="page">
+              <wp14:pctHeight>0</wp14:pctHeight>
+            </wp14:sizeRelV>
+          </wp:anchor>
+        </w:drawing>
       </w:r>
     </w:p>
     <w:p>
@@ -2942,6 +3335,68 @@
     </w:p>
     <w:p>
       <w:pPr>
+        <w:pStyle w:val="ListParagraph"/>
+        <w:rPr>
+          <w:lang w:val="el-GR"/>
+        </w:rPr>
+      </w:pPr>
+      <w:r>
+        <w:rPr>
+          <w:lang w:val="el-GR"/>
+        </w:rPr>
+        <w:drawing>
+          <wp:anchor distT="0" distB="0" distL="114300" distR="114300" simplePos="0" relativeHeight="251672576" behindDoc="0" locked="0" layoutInCell="1" allowOverlap="1">
+            <wp:simplePos x="0" y="0"/>
+            <wp:positionH relativeFrom="column">
+              <wp:posOffset>1389380</wp:posOffset>
+            </wp:positionH>
+            <wp:positionV relativeFrom="paragraph">
+              <wp:posOffset>-635</wp:posOffset>
+            </wp:positionV>
+            <wp:extent cx="3164894" cy="1966224"/>
+            <wp:effectExtent l="0" t="0" r="0" b="0"/>
+            <wp:wrapTopAndBottom/>
+            <wp:docPr id="25" name="Picture 25"/>
+            <wp:cNvGraphicFramePr>
+              <a:graphicFrameLocks xmlns:a="http://schemas.openxmlformats.org/drawingml/2006/main" noChangeAspect="1"/>
+            </wp:cNvGraphicFramePr>
+            <a:graphic xmlns:a="http://schemas.openxmlformats.org/drawingml/2006/main">
+              <a:graphicData uri="http://schemas.openxmlformats.org/drawingml/2006/picture">
+                <pic:pic xmlns:pic="http://schemas.openxmlformats.org/drawingml/2006/picture">
+                  <pic:nvPicPr>
+                    <pic:cNvPr id="1" name=""/>
+                    <pic:cNvPicPr/>
+                  </pic:nvPicPr>
+                  <pic:blipFill>
+                    <a:blip r:embed="rId23">
+                      <a:extLst>
+                        <a:ext uri="{28A0092B-C50C-407E-A947-70E740481C1C}">
+                          <a14:useLocalDpi xmlns:a14="http://schemas.microsoft.com/office/drawing/2010/main" val="0"/>
+                        </a:ext>
+                      </a:extLst>
+                    </a:blip>
+                    <a:stretch>
+                      <a:fillRect/>
+                    </a:stretch>
+                  </pic:blipFill>
+                  <pic:spPr>
+                    <a:xfrm>
+                      <a:off x="0" y="0"/>
+                      <a:ext cx="3164894" cy="1966224"/>
+                    </a:xfrm>
+                    <a:prstGeom prst="rect">
+                      <a:avLst/>
+                    </a:prstGeom>
+                  </pic:spPr>
+                </pic:pic>
+              </a:graphicData>
+            </a:graphic>
+          </wp:anchor>
+        </w:drawing>
+      </w:r>
+    </w:p>
+    <w:p>
+      <w:pPr>
         <w:pStyle w:val="Heading2"/>
         <w:rPr>
           <w:lang w:val="el-GR"/>
@@ -2952,6 +3407,7 @@
         <w:rPr>
           <w:lang w:val="el-GR"/>
         </w:rPr>
+        <w:lastRenderedPageBreak/>
         <w:t>Επιπλέον</w:t>
       </w:r>
       <w:r>
@@ -2988,7 +3444,7 @@
           <w:lang w:val="el-GR"/>
         </w:rPr>
         <w:drawing>
-          <wp:anchor distT="0" distB="0" distL="114300" distR="114300" simplePos="0" relativeHeight="251666432" behindDoc="0" locked="0" layoutInCell="1" allowOverlap="1" wp14:anchorId="3C938BA9" wp14:editId="0361A14C">
+          <wp:anchor distT="0" distB="0" distL="114300" distR="114300" simplePos="0" relativeHeight="251666432" behindDoc="0" locked="0" layoutInCell="1" allowOverlap="1" wp14:anchorId="51B856CC" wp14:editId="27E6C11A">
             <wp:simplePos x="0" y="0"/>
             <wp:positionH relativeFrom="column">
               <wp:posOffset>0</wp:posOffset>
@@ -3019,7 +3475,7 @@
                     <pic:cNvPicPr/>
                   </pic:nvPicPr>
                   <pic:blipFill>
-                    <a:blip r:embed="rId18" cstate="print">
+                    <a:blip r:embed="rId24" cstate="print">
                       <a:extLst>
                         <a:ext uri="{28A0092B-C50C-407E-A947-70E740481C1C}">
                           <a14:useLocalDpi xmlns:a14="http://schemas.microsoft.com/office/drawing/2010/main" val="0"/>
@@ -3308,7 +3764,7 @@
                     <pic:cNvPicPr/>
                   </pic:nvPicPr>
                   <pic:blipFill>
-                    <a:blip r:embed="rId19" cstate="print">
+                    <a:blip r:embed="rId25" cstate="print">
                       <a:extLst>
                         <a:ext uri="{28A0092B-C50C-407E-A947-70E740481C1C}">
                           <a14:useLocalDpi xmlns:a14="http://schemas.microsoft.com/office/drawing/2010/main" val="0"/>
@@ -3468,7 +3924,7 @@
                     <pic:cNvPicPr/>
                   </pic:nvPicPr>
                   <pic:blipFill>
-                    <a:blip r:embed="rId20">
+                    <a:blip r:embed="rId26">
                       <a:extLst>
                         <a:ext uri="{28A0092B-C50C-407E-A947-70E740481C1C}">
                           <a14:useLocalDpi xmlns:a14="http://schemas.microsoft.com/office/drawing/2010/main" val="0"/>
@@ -5007,7 +5463,7 @@
 </file>
 
 <file path=customXml/itemProps1.xml><?xml version="1.0" encoding="utf-8"?>
-<ds:datastoreItem xmlns:ds="http://schemas.openxmlformats.org/officeDocument/2006/customXml" ds:itemID="{86935D10-BC9C-45E6-9151-B0397B7422FC}">
+<ds:datastoreItem xmlns:ds="http://schemas.openxmlformats.org/officeDocument/2006/customXml" ds:itemID="{ED9E1C64-2618-49C5-B364-B1B1103E0693}">
   <ds:schemaRefs>
     <ds:schemaRef ds:uri="http://schemas.openxmlformats.org/officeDocument/2006/bibliography"/>
   </ds:schemaRefs>

</xml_diff>